<commit_message>
MD-90: APU section updated
</commit_message>
<xml_diff>
--- a/MD-90/Differences.docx
+++ b/MD-90/Differences.docx
@@ -111,7 +111,7 @@
           <w:sz w:val="24"/>
           <w:szCs w:val="24"/>
         </w:rPr>
-        <w:t>11/14/2025</w:t>
+        <w:t>4/13/2026</w:t>
       </w:r>
       <w:r>
         <w:rPr>
@@ -2479,15 +2479,7 @@
     </w:p>
     <w:p>
       <w:r>
-        <w:t xml:space="preserve">On </w:t>
-      </w:r>
-      <w:proofErr w:type="gramStart"/>
-      <w:r>
-        <w:t>the MD</w:t>
-      </w:r>
-      <w:proofErr w:type="gramEnd"/>
-      <w:r>
-        <w:t>-80, the difference in engine indications for the Automatic Thrust Restoration (ATR) system to activate is 0.25 EPR or 7% N1.</w:t>
+        <w:t>On the MD-80, the difference in engine indications for the Automatic Thrust Restoration (ATR) system to activate is 0.25 EPR or 7% N1.</w:t>
       </w:r>
     </w:p>
     <w:p>
@@ -2663,7 +2655,22 @@
         <w:t>GTCP85-98DHF</w:t>
       </w:r>
       <w:r>
-        <w:t>. No Engine Control Unit (ECU) is installed.</w:t>
+        <w:t xml:space="preserve">. </w:t>
+      </w:r>
+      <w:r>
+        <w:t>An</w:t>
+      </w:r>
+      <w:r>
+        <w:t xml:space="preserve"> Engine Control Unit (ECU) is </w:t>
+      </w:r>
+      <w:r>
+        <w:t xml:space="preserve">optionally </w:t>
+      </w:r>
+      <w:r>
+        <w:t>installed.</w:t>
+      </w:r>
+      <w:r>
+        <w:t xml:space="preserve"> APU gauges are different on ECU-equipped airplanes.</w:t>
       </w:r>
     </w:p>
     <w:p>
@@ -2676,6 +2683,9 @@
       <w:r>
         <w:t xml:space="preserve"> ECU.</w:t>
       </w:r>
+      <w:r>
+        <w:t xml:space="preserve"> On non-EFD airplanes, APU gauges are very similar those on ECU-equipped MD-80’s.</w:t>
+      </w:r>
     </w:p>
     <w:p/>
     <w:p>
@@ -2710,7 +2720,13 @@
     </w:p>
     <w:p>
       <w:r>
-        <w:t>The MD-90 is unique in that the external power switch is normally in the “ON” position. The relay connecting external power to the tie bus is controlled by the Electrical Power Control Unit (EPCU).</w:t>
+        <w:t>The MD-90 is unique in that the external power switch is normally in the “ON” position</w:t>
+      </w:r>
+      <w:r>
+        <w:t>, aside from when the airplane is powered down to cold and dark</w:t>
+      </w:r>
+      <w:r>
+        <w:t>. The relay connecting external power to the tie bus is controlled by the Electrical Power Control Unit (EPCU).</w:t>
       </w:r>
     </w:p>
     <w:p/>
@@ -2780,26 +2796,9 @@
     </w:p>
     <w:p>
       <w:r>
-        <w:t xml:space="preserve">Some of the MD-90 electrical </w:t>
-      </w:r>
-      <w:proofErr w:type="gramStart"/>
-      <w:r>
-        <w:t>system is</w:t>
-      </w:r>
-      <w:proofErr w:type="gramEnd"/>
-      <w:r>
-        <w:t xml:space="preserve"> controlled by the Electrical Power Control Panel (EPCU). The EPCU will parallel sources to buses </w:t>
-      </w:r>
-      <w:proofErr w:type="gramStart"/>
-      <w:r>
-        <w:t>in order to</w:t>
-      </w:r>
-      <w:proofErr w:type="gramEnd"/>
-      <w:r>
-        <w:t xml:space="preserve"> prevent a break in power when transferring. The EPCU also controls the AC and DC bus ties as well as emergency power.</w:t>
-      </w:r>
-    </w:p>
-    <w:p/>
+        <w:t>Some of the MD-90 electrical system is controlled by the Electrical Power Control Panel (EPCU). The EPCU will parallel sources to buses in order to prevent a break in power when transferring. The EPCU also controls the AC and DC bus ties as well as emergency power.</w:t>
+      </w:r>
+    </w:p>
     <w:p>
       <w:pPr>
         <w:pStyle w:val="Heading2"/>
@@ -2824,15 +2823,7 @@
     </w:p>
     <w:p>
       <w:r>
-        <w:t xml:space="preserve">There are </w:t>
-      </w:r>
-      <w:proofErr w:type="gramStart"/>
-      <w:r>
-        <w:t>not</w:t>
-      </w:r>
-      <w:proofErr w:type="gramEnd"/>
-      <w:r>
-        <w:t xml:space="preserve"> IDGs or CSDs on the MD-90. Engine electrical power is provided via </w:t>
+        <w:t xml:space="preserve">There are not IDGs or CSDs on the MD-90. Engine electrical power is provided via </w:t>
       </w:r>
       <w:r>
         <w:t>a Variable Speed Constant Frequency (VSCF) system. The generators output 232-400V 800-1600Hz</w:t>
@@ -2852,15 +2843,7 @@
     </w:p>
     <w:p>
       <w:r>
-        <w:t xml:space="preserve">Separate cooling is provided for the VSCFs in the E/E compartment in </w:t>
-      </w:r>
-      <w:proofErr w:type="gramStart"/>
-      <w:r>
-        <w:t>the front</w:t>
-      </w:r>
-      <w:proofErr w:type="gramEnd"/>
-      <w:r>
-        <w:t xml:space="preserve"> of the airplane.</w:t>
+        <w:t>Separate cooling is provided for the VSCFs in the E/E compartment in the front of the airplane.</w:t>
       </w:r>
     </w:p>
     <w:p/>
@@ -2876,15 +2859,7 @@
     </w:p>
     <w:p>
       <w:r>
-        <w:t>The MD-</w:t>
-      </w:r>
-      <w:proofErr w:type="gramStart"/>
-      <w:r>
-        <w:t>80 tie</w:t>
-      </w:r>
-      <w:proofErr w:type="gramEnd"/>
-      <w:r>
-        <w:t xml:space="preserve"> bus is controlled by a single switch. The normal position is “AUTO”.</w:t>
+        <w:t>The MD-80 tie bus is controlled by a single switch. The normal position is “AUTO”.</w:t>
       </w:r>
     </w:p>
     <w:p>
@@ -2914,23 +2889,7 @@
     </w:p>
     <w:p>
       <w:r>
-        <w:t xml:space="preserve">The MD-80 has two Pratt &amp; Whitney JT8D-200 engines. The engines are controlled conventionally via cables from </w:t>
-      </w:r>
-      <w:proofErr w:type="gramStart"/>
-      <w:r>
-        <w:t>the throttles</w:t>
-      </w:r>
-      <w:proofErr w:type="gramEnd"/>
-      <w:r>
-        <w:t xml:space="preserve"> to </w:t>
-      </w:r>
-      <w:proofErr w:type="gramStart"/>
-      <w:r>
-        <w:t>the fuel</w:t>
-      </w:r>
-      <w:proofErr w:type="gramEnd"/>
-      <w:r>
-        <w:t xml:space="preserve"> control units.</w:t>
+        <w:t>The MD-80 has two Pratt &amp; Whitney JT8D-200 engines. The engines are controlled conventionally via cables from the throttles to the fuel control units.</w:t>
       </w:r>
       <w:r>
         <w:t xml:space="preserve"> Reverse thrust is accomplished via clamshell buckets.</w:t>
@@ -2947,15 +2906,7 @@
         <w:t>Reverse a</w:t>
       </w:r>
       <w:r>
-        <w:t xml:space="preserve">ctivation above 60 knots </w:t>
-      </w:r>
-      <w:proofErr w:type="gramStart"/>
-      <w:r>
-        <w:t>provide</w:t>
-      </w:r>
-      <w:proofErr w:type="gramEnd"/>
-      <w:r>
-        <w:t xml:space="preserve"> 1.3 EPR. Below 60 knots, only 1.07 EPR is available.</w:t>
+        <w:t>ctivation above 60 knots provide 1.3 EPR. Below 60 knots, only 1.07 EPR is available.</w:t>
       </w:r>
     </w:p>
     <w:p/>
@@ -3037,135 +2988,103 @@
     </w:p>
     <w:p>
       <w:r>
-        <w:t xml:space="preserve">The MD-90 has electronic instrumentation for the engines and has </w:t>
-      </w:r>
-      <w:proofErr w:type="gramStart"/>
-      <w:r>
-        <w:t>vibration indications added</w:t>
-      </w:r>
-      <w:proofErr w:type="gramEnd"/>
+        <w:t>The MD-90 has electronic instrumentation for the engines and has vibration indications added.</w:t>
+      </w:r>
+    </w:p>
+    <w:p/>
+    <w:p>
+      <w:pPr>
+        <w:pStyle w:val="Heading2"/>
+      </w:pPr>
+      <w:bookmarkStart w:id="20" w:name="_Toc211989222"/>
+      <w:r>
+        <w:t>N1 Mode</w:t>
+      </w:r>
+      <w:bookmarkEnd w:id="20"/>
+    </w:p>
+    <w:p>
+      <w:r>
+        <w:t>On the MD-80, Full Authority Digital Engine Control (FADEC) and thus N1 Mode is not installed.</w:t>
+      </w:r>
+    </w:p>
+    <w:p>
+      <w:r>
+        <w:t xml:space="preserve">On the MD-90, </w:t>
+      </w:r>
+      <w:r>
+        <w:t xml:space="preserve">the normal FADEC control mode is EPR. </w:t>
+      </w:r>
+      <w:r>
+        <w:t>N1 Mode can be activated if EPR indication is unreliable, or the system can automatically revert to N1 Mode</w:t>
+      </w:r>
+      <w:r>
+        <w:t xml:space="preserve"> if a failure occurs. N1 Mode is also used for reverse thrust. Thrust limitation and the Auto Thrust System (ATS) are not available in N1 Mode.</w:t>
+      </w:r>
+    </w:p>
+    <w:p/>
+    <w:p>
+      <w:pPr>
+        <w:pStyle w:val="Heading2"/>
+      </w:pPr>
+      <w:bookmarkStart w:id="21" w:name="_Toc211989223"/>
+      <w:r>
+        <w:t>Thrust Limits</w:t>
+      </w:r>
+      <w:bookmarkEnd w:id="21"/>
+    </w:p>
+    <w:p>
+      <w:r>
+        <w:t xml:space="preserve">On the MD-80, thrust limits are computed by the Digital Flight Guidance System. On aircraft without Engine Display Panel (EDP), the active limit is displayed and selected on the Thrust Rating Indicator (TRI). On aircraft with EDP, the active limit is displayed on the EDP and selected on the Thrust Rating Panel (TRP). </w:t>
+      </w:r>
+      <w:r>
+        <w:t>Separate</w:t>
+      </w:r>
+      <w:r>
+        <w:t xml:space="preserve"> “T/O” and “G/A” modes are available. </w:t>
+      </w:r>
+      <w:r>
+        <w:t xml:space="preserve">The </w:t>
+      </w:r>
+      <w:r>
+        <w:t xml:space="preserve">“CRZ” mode is available. </w:t>
+      </w:r>
+      <w:r>
+        <w:t xml:space="preserve">The </w:t>
+      </w:r>
+      <w:r>
+        <w:t xml:space="preserve">“EPR SEL” mode is not </w:t>
+      </w:r>
+      <w:r>
+        <w:t>available</w:t>
+      </w:r>
+      <w:r>
+        <w:t xml:space="preserve">. </w:t>
+      </w:r>
+      <w:r>
+        <w:t>Thrust limit selection is mostly manual aside from certain automatic transitions</w:t>
+      </w:r>
+      <w:r>
+        <w:t xml:space="preserve"> to </w:t>
+      </w:r>
+      <w:r>
+        <w:t>“</w:t>
+      </w:r>
+      <w:r>
+        <w:t>G/A</w:t>
+      </w:r>
+      <w:r>
+        <w:t>”</w:t>
+      </w:r>
+      <w:r>
+        <w:t xml:space="preserve"> mode</w:t>
+      </w:r>
       <w:r>
         <w:t>.</w:t>
       </w:r>
     </w:p>
-    <w:p/>
-    <w:p>
-      <w:pPr>
-        <w:pStyle w:val="Heading2"/>
-      </w:pPr>
-      <w:bookmarkStart w:id="20" w:name="_Toc211989222"/>
-      <w:r>
-        <w:t>N1 Mode</w:t>
-      </w:r>
-      <w:bookmarkEnd w:id="20"/>
-    </w:p>
-    <w:p>
-      <w:r>
-        <w:t xml:space="preserve">On the MD-80, Full Authority Digital Engine Control (FADEC) and thus N1 Mode </w:t>
-      </w:r>
-      <w:proofErr w:type="gramStart"/>
-      <w:r>
-        <w:t>is</w:t>
-      </w:r>
-      <w:proofErr w:type="gramEnd"/>
-      <w:r>
-        <w:t xml:space="preserve"> not installed.</w:t>
-      </w:r>
-    </w:p>
-    <w:p>
-      <w:r>
-        <w:t xml:space="preserve">On the MD-90, </w:t>
-      </w:r>
-      <w:r>
-        <w:t xml:space="preserve">the normal FADEC control mode is EPR. </w:t>
-      </w:r>
-      <w:r>
-        <w:t>N1 Mode can be activated if EPR indication is unreliable, or the system can automatically revert to N1 Mode</w:t>
-      </w:r>
-      <w:r>
-        <w:t xml:space="preserve"> if a failure occurs. N1 Mode is also used for reverse thrust. Thrust limitation and the Auto Thrust System (ATS) are not available in </w:t>
-      </w:r>
-      <w:proofErr w:type="gramStart"/>
-      <w:r>
-        <w:t>N1 Mode</w:t>
-      </w:r>
-      <w:proofErr w:type="gramEnd"/>
-      <w:r>
-        <w:t>.</w:t>
-      </w:r>
-    </w:p>
-    <w:p/>
-    <w:p>
-      <w:pPr>
-        <w:pStyle w:val="Heading2"/>
-      </w:pPr>
-      <w:bookmarkStart w:id="21" w:name="_Toc211989223"/>
-      <w:r>
-        <w:t>Thrust Limits</w:t>
-      </w:r>
-      <w:bookmarkEnd w:id="21"/>
-    </w:p>
-    <w:p>
-      <w:r>
-        <w:t xml:space="preserve">On the MD-80, thrust limits are computed by the Digital Flight Guidance System. On aircraft without Engine Display Panel (EDP), the active limit is displayed and selected on the Thrust Rating Indicator (TRI). On aircraft with EDP, the active limit is displayed on the EDP and selected on the Thrust Rating Panel (TRP). </w:t>
-      </w:r>
-      <w:r>
-        <w:t>Separate</w:t>
-      </w:r>
-      <w:r>
-        <w:t xml:space="preserve"> “T/O” and “G/A” modes are available. </w:t>
-      </w:r>
-      <w:r>
-        <w:t xml:space="preserve">The </w:t>
-      </w:r>
-      <w:r>
-        <w:t xml:space="preserve">“CRZ” mode is available. </w:t>
-      </w:r>
-      <w:r>
-        <w:t xml:space="preserve">The </w:t>
-      </w:r>
-      <w:r>
-        <w:t xml:space="preserve">“EPR SEL” mode is not </w:t>
-      </w:r>
-      <w:r>
-        <w:t>available</w:t>
-      </w:r>
-      <w:r>
-        <w:t xml:space="preserve">. </w:t>
-      </w:r>
-      <w:r>
-        <w:t>Thrust limit selection is mostly manual aside from certain automatic transitions</w:t>
-      </w:r>
-      <w:r>
-        <w:t xml:space="preserve"> to </w:t>
-      </w:r>
-      <w:r>
-        <w:t>“</w:t>
-      </w:r>
-      <w:r>
-        <w:t>G/A</w:t>
-      </w:r>
-      <w:r>
-        <w:t>”</w:t>
-      </w:r>
-      <w:r>
-        <w:t xml:space="preserve"> mode</w:t>
-      </w:r>
-      <w:r>
-        <w:t>.</w:t>
-      </w:r>
-    </w:p>
-    <w:p>
-      <w:r>
-        <w:t xml:space="preserve">On </w:t>
-      </w:r>
-      <w:proofErr w:type="gramStart"/>
-      <w:r>
-        <w:t>the MD</w:t>
-      </w:r>
-      <w:proofErr w:type="gramEnd"/>
-      <w:r>
-        <w:t>-90, thrust limits are computed by the Full Authority Digital Engine Control (FADEC) units installed on each engine.</w:t>
+    <w:p>
+      <w:r>
+        <w:t>On the MD-90, thrust limits are computed by the Full Authority Digital Engine Control (FADEC) units installed on each engine.</w:t>
       </w:r>
       <w:r>
         <w:t xml:space="preserve"> There are small differences between standard and EFD MD-90’s.</w:t>
@@ -3419,15 +3338,7 @@
     </w:p>
     <w:p>
       <w:r>
-        <w:t xml:space="preserve">The </w:t>
-      </w:r>
-      <w:proofErr w:type="gramStart"/>
-      <w:r>
-        <w:t>MD-90’s</w:t>
-      </w:r>
-      <w:proofErr w:type="gramEnd"/>
-      <w:r>
-        <w:t xml:space="preserve"> elevators are normally hydraulically driven. Manual reversion to control tabs is available if hydraulics fail or the ELEV CONT ELEV switch is selected </w:t>
+        <w:t xml:space="preserve">The MD-90’s elevators are normally hydraulically driven. Manual reversion to control tabs is available if hydraulics fail or the ELEV CONT ELEV switch is selected </w:t>
       </w:r>
       <w:r>
         <w:t>“OFF”</w:t>
@@ -3491,15 +3402,7 @@
     </w:p>
     <w:p>
       <w:r>
-        <w:t xml:space="preserve">Not all MD-80’s </w:t>
-      </w:r>
-      <w:proofErr w:type="gramStart"/>
-      <w:r>
-        <w:t>have</w:t>
-      </w:r>
-      <w:proofErr w:type="gramEnd"/>
-      <w:r>
-        <w:t xml:space="preserve"> </w:t>
+        <w:t xml:space="preserve">Not all MD-80’s have </w:t>
       </w:r>
       <w:r>
         <w:t xml:space="preserve">AFB </w:t>
@@ -3534,15 +3437,7 @@
     </w:p>
     <w:p>
       <w:r>
-        <w:t xml:space="preserve">All MD-90’s </w:t>
-      </w:r>
-      <w:proofErr w:type="gramStart"/>
-      <w:r>
-        <w:t>have</w:t>
-      </w:r>
-      <w:proofErr w:type="gramEnd"/>
-      <w:r>
-        <w:t xml:space="preserve"> AFB installed.</w:t>
+        <w:t>All MD-90’s have AFB installed.</w:t>
       </w:r>
     </w:p>
     <w:p>
@@ -3827,23 +3722,7 @@
     </w:p>
     <w:p>
       <w:r>
-        <w:t xml:space="preserve">The Enhanced Flight Deck (EFD) contains several major and minor changes to the </w:t>
-      </w:r>
-      <w:proofErr w:type="gramStart"/>
-      <w:r>
-        <w:t>flightdeck</w:t>
-      </w:r>
-      <w:proofErr w:type="gramEnd"/>
-      <w:r>
-        <w:t xml:space="preserve"> to make it </w:t>
-      </w:r>
-      <w:proofErr w:type="gramStart"/>
-      <w:r>
-        <w:t>similar to</w:t>
-      </w:r>
-      <w:proofErr w:type="gramEnd"/>
-      <w:r>
-        <w:t xml:space="preserve"> the upcoming Advanced Common Flightdeck in design for the MD-95 (Boeing 717).</w:t>
+        <w:t>The Enhanced Flight Deck (EFD) contains several major and minor changes to the flightdeck to make it similar to the upcoming Advanced Common Flightdeck in design for the MD-95 (Boeing 717).</w:t>
       </w:r>
     </w:p>
     <w:p>

</xml_diff>

<commit_message>
MD-90 Diff doc improved
</commit_message>
<xml_diff>
--- a/MD-90/Differences.docx
+++ b/MD-90/Differences.docx
@@ -229,7 +229,7 @@
           <w:r>
             <w:fldChar w:fldCharType="separate"/>
           </w:r>
-          <w:hyperlink w:anchor="_Toc211989204" w:history="1">
+          <w:hyperlink w:anchor="_Toc226996778" w:history="1">
             <w:r>
               <w:rPr>
                 <w:rStyle w:val="Hyperlink"/>
@@ -256,7 +256,7 @@
                 <w:noProof/>
                 <w:webHidden/>
               </w:rPr>
-              <w:instrText xml:space="preserve"> PAGEREF _Toc211989204 \h </w:instrText>
+              <w:instrText xml:space="preserve"> PAGEREF _Toc226996778 \h </w:instrText>
             </w:r>
             <w:r>
               <w:rPr>
@@ -301,7 +301,7 @@
               <w14:ligatures w14:val="standardContextual"/>
             </w:rPr>
           </w:pPr>
-          <w:hyperlink w:anchor="_Toc211989205" w:history="1">
+          <w:hyperlink w:anchor="_Toc226996779" w:history="1">
             <w:r>
               <w:rPr>
                 <w:rStyle w:val="Hyperlink"/>
@@ -328,7 +328,7 @@
                 <w:noProof/>
                 <w:webHidden/>
               </w:rPr>
-              <w:instrText xml:space="preserve"> PAGEREF _Toc211989205 \h </w:instrText>
+              <w:instrText xml:space="preserve"> PAGEREF _Toc226996779 \h </w:instrText>
             </w:r>
             <w:r>
               <w:rPr>
@@ -373,7 +373,7 @@
               <w14:ligatures w14:val="standardContextual"/>
             </w:rPr>
           </w:pPr>
-          <w:hyperlink w:anchor="_Toc211989206" w:history="1">
+          <w:hyperlink w:anchor="_Toc226996780" w:history="1">
             <w:r>
               <w:rPr>
                 <w:rStyle w:val="Hyperlink"/>
@@ -400,7 +400,7 @@
                 <w:noProof/>
                 <w:webHidden/>
               </w:rPr>
-              <w:instrText xml:space="preserve"> PAGEREF _Toc211989206 \h </w:instrText>
+              <w:instrText xml:space="preserve"> PAGEREF _Toc226996780 \h </w:instrText>
             </w:r>
             <w:r>
               <w:rPr>
@@ -445,7 +445,7 @@
               <w14:ligatures w14:val="standardContextual"/>
             </w:rPr>
           </w:pPr>
-          <w:hyperlink w:anchor="_Toc211989207" w:history="1">
+          <w:hyperlink w:anchor="_Toc226996781" w:history="1">
             <w:r>
               <w:rPr>
                 <w:rStyle w:val="Hyperlink"/>
@@ -472,7 +472,7 @@
                 <w:noProof/>
                 <w:webHidden/>
               </w:rPr>
-              <w:instrText xml:space="preserve"> PAGEREF _Toc211989207 \h </w:instrText>
+              <w:instrText xml:space="preserve"> PAGEREF _Toc226996781 \h </w:instrText>
             </w:r>
             <w:r>
               <w:rPr>
@@ -517,7 +517,7 @@
               <w14:ligatures w14:val="standardContextual"/>
             </w:rPr>
           </w:pPr>
-          <w:hyperlink w:anchor="_Toc211989208" w:history="1">
+          <w:hyperlink w:anchor="_Toc226996782" w:history="1">
             <w:r>
               <w:rPr>
                 <w:rStyle w:val="Hyperlink"/>
@@ -544,7 +544,7 @@
                 <w:noProof/>
                 <w:webHidden/>
               </w:rPr>
-              <w:instrText xml:space="preserve"> PAGEREF _Toc211989208 \h </w:instrText>
+              <w:instrText xml:space="preserve"> PAGEREF _Toc226996782 \h </w:instrText>
             </w:r>
             <w:r>
               <w:rPr>
@@ -589,7 +589,7 @@
               <w14:ligatures w14:val="standardContextual"/>
             </w:rPr>
           </w:pPr>
-          <w:hyperlink w:anchor="_Toc211989209" w:history="1">
+          <w:hyperlink w:anchor="_Toc226996783" w:history="1">
             <w:r>
               <w:rPr>
                 <w:rStyle w:val="Hyperlink"/>
@@ -616,7 +616,7 @@
                 <w:noProof/>
                 <w:webHidden/>
               </w:rPr>
-              <w:instrText xml:space="preserve"> PAGEREF _Toc211989209 \h </w:instrText>
+              <w:instrText xml:space="preserve"> PAGEREF _Toc226996783 \h </w:instrText>
             </w:r>
             <w:r>
               <w:rPr>
@@ -661,7 +661,7 @@
               <w14:ligatures w14:val="standardContextual"/>
             </w:rPr>
           </w:pPr>
-          <w:hyperlink w:anchor="_Toc211989210" w:history="1">
+          <w:hyperlink w:anchor="_Toc226996784" w:history="1">
             <w:r>
               <w:rPr>
                 <w:rStyle w:val="Hyperlink"/>
@@ -688,7 +688,7 @@
                 <w:noProof/>
                 <w:webHidden/>
               </w:rPr>
-              <w:instrText xml:space="preserve"> PAGEREF _Toc211989210 \h </w:instrText>
+              <w:instrText xml:space="preserve"> PAGEREF _Toc226996784 \h </w:instrText>
             </w:r>
             <w:r>
               <w:rPr>
@@ -733,7 +733,7 @@
               <w14:ligatures w14:val="standardContextual"/>
             </w:rPr>
           </w:pPr>
-          <w:hyperlink w:anchor="_Toc211989211" w:history="1">
+          <w:hyperlink w:anchor="_Toc226996785" w:history="1">
             <w:r>
               <w:rPr>
                 <w:rStyle w:val="Hyperlink"/>
@@ -760,7 +760,7 @@
                 <w:noProof/>
                 <w:webHidden/>
               </w:rPr>
-              <w:instrText xml:space="preserve"> PAGEREF _Toc211989211 \h </w:instrText>
+              <w:instrText xml:space="preserve"> PAGEREF _Toc226996785 \h </w:instrText>
             </w:r>
             <w:r>
               <w:rPr>
@@ -805,7 +805,7 @@
               <w14:ligatures w14:val="standardContextual"/>
             </w:rPr>
           </w:pPr>
-          <w:hyperlink w:anchor="_Toc211989212" w:history="1">
+          <w:hyperlink w:anchor="_Toc226996786" w:history="1">
             <w:r>
               <w:rPr>
                 <w:rStyle w:val="Hyperlink"/>
@@ -832,7 +832,7 @@
                 <w:noProof/>
                 <w:webHidden/>
               </w:rPr>
-              <w:instrText xml:space="preserve"> PAGEREF _Toc211989212 \h </w:instrText>
+              <w:instrText xml:space="preserve"> PAGEREF _Toc226996786 \h </w:instrText>
             </w:r>
             <w:r>
               <w:rPr>
@@ -877,7 +877,7 @@
               <w14:ligatures w14:val="standardContextual"/>
             </w:rPr>
           </w:pPr>
-          <w:hyperlink w:anchor="_Toc211989213" w:history="1">
+          <w:hyperlink w:anchor="_Toc226996787" w:history="1">
             <w:r>
               <w:rPr>
                 <w:rStyle w:val="Hyperlink"/>
@@ -904,7 +904,7 @@
                 <w:noProof/>
                 <w:webHidden/>
               </w:rPr>
-              <w:instrText xml:space="preserve"> PAGEREF _Toc211989213 \h </w:instrText>
+              <w:instrText xml:space="preserve"> PAGEREF _Toc226996787 \h </w:instrText>
             </w:r>
             <w:r>
               <w:rPr>
@@ -949,7 +949,7 @@
               <w14:ligatures w14:val="standardContextual"/>
             </w:rPr>
           </w:pPr>
-          <w:hyperlink w:anchor="_Toc211989214" w:history="1">
+          <w:hyperlink w:anchor="_Toc226996788" w:history="1">
             <w:r>
               <w:rPr>
                 <w:rStyle w:val="Hyperlink"/>
@@ -976,7 +976,7 @@
                 <w:noProof/>
                 <w:webHidden/>
               </w:rPr>
-              <w:instrText xml:space="preserve"> PAGEREF _Toc211989214 \h </w:instrText>
+              <w:instrText xml:space="preserve"> PAGEREF _Toc226996788 \h </w:instrText>
             </w:r>
             <w:r>
               <w:rPr>
@@ -1021,7 +1021,7 @@
               <w14:ligatures w14:val="standardContextual"/>
             </w:rPr>
           </w:pPr>
-          <w:hyperlink w:anchor="_Toc211989215" w:history="1">
+          <w:hyperlink w:anchor="_Toc226996789" w:history="1">
             <w:r>
               <w:rPr>
                 <w:rStyle w:val="Hyperlink"/>
@@ -1048,7 +1048,7 @@
                 <w:noProof/>
                 <w:webHidden/>
               </w:rPr>
-              <w:instrText xml:space="preserve"> PAGEREF _Toc211989215 \h </w:instrText>
+              <w:instrText xml:space="preserve"> PAGEREF _Toc226996789 \h </w:instrText>
             </w:r>
             <w:r>
               <w:rPr>
@@ -1093,7 +1093,7 @@
               <w14:ligatures w14:val="standardContextual"/>
             </w:rPr>
           </w:pPr>
-          <w:hyperlink w:anchor="_Toc211989216" w:history="1">
+          <w:hyperlink w:anchor="_Toc226996790" w:history="1">
             <w:r>
               <w:rPr>
                 <w:rStyle w:val="Hyperlink"/>
@@ -1120,7 +1120,7 @@
                 <w:noProof/>
                 <w:webHidden/>
               </w:rPr>
-              <w:instrText xml:space="preserve"> PAGEREF _Toc211989216 \h </w:instrText>
+              <w:instrText xml:space="preserve"> PAGEREF _Toc226996790 \h </w:instrText>
             </w:r>
             <w:r>
               <w:rPr>
@@ -1165,7 +1165,7 @@
               <w14:ligatures w14:val="standardContextual"/>
             </w:rPr>
           </w:pPr>
-          <w:hyperlink w:anchor="_Toc211989217" w:history="1">
+          <w:hyperlink w:anchor="_Toc226996791" w:history="1">
             <w:r>
               <w:rPr>
                 <w:rStyle w:val="Hyperlink"/>
@@ -1192,7 +1192,7 @@
                 <w:noProof/>
                 <w:webHidden/>
               </w:rPr>
-              <w:instrText xml:space="preserve"> PAGEREF _Toc211989217 \h </w:instrText>
+              <w:instrText xml:space="preserve"> PAGEREF _Toc226996791 \h </w:instrText>
             </w:r>
             <w:r>
               <w:rPr>
@@ -1237,7 +1237,7 @@
               <w14:ligatures w14:val="standardContextual"/>
             </w:rPr>
           </w:pPr>
-          <w:hyperlink w:anchor="_Toc211989218" w:history="1">
+          <w:hyperlink w:anchor="_Toc226996792" w:history="1">
             <w:r>
               <w:rPr>
                 <w:rStyle w:val="Hyperlink"/>
@@ -1264,7 +1264,7 @@
                 <w:noProof/>
                 <w:webHidden/>
               </w:rPr>
-              <w:instrText xml:space="preserve"> PAGEREF _Toc211989218 \h </w:instrText>
+              <w:instrText xml:space="preserve"> PAGEREF _Toc226996792 \h </w:instrText>
             </w:r>
             <w:r>
               <w:rPr>
@@ -1309,7 +1309,7 @@
               <w14:ligatures w14:val="standardContextual"/>
             </w:rPr>
           </w:pPr>
-          <w:hyperlink w:anchor="_Toc211989219" w:history="1">
+          <w:hyperlink w:anchor="_Toc226996793" w:history="1">
             <w:r>
               <w:rPr>
                 <w:rStyle w:val="Hyperlink"/>
@@ -1336,7 +1336,7 @@
                 <w:noProof/>
                 <w:webHidden/>
               </w:rPr>
-              <w:instrText xml:space="preserve"> PAGEREF _Toc211989219 \h </w:instrText>
+              <w:instrText xml:space="preserve"> PAGEREF _Toc226996793 \h </w:instrText>
             </w:r>
             <w:r>
               <w:rPr>
@@ -1381,7 +1381,7 @@
               <w14:ligatures w14:val="standardContextual"/>
             </w:rPr>
           </w:pPr>
-          <w:hyperlink w:anchor="_Toc211989220" w:history="1">
+          <w:hyperlink w:anchor="_Toc226996794" w:history="1">
             <w:r>
               <w:rPr>
                 <w:rStyle w:val="Hyperlink"/>
@@ -1408,7 +1408,7 @@
                 <w:noProof/>
                 <w:webHidden/>
               </w:rPr>
-              <w:instrText xml:space="preserve"> PAGEREF _Toc211989220 \h </w:instrText>
+              <w:instrText xml:space="preserve"> PAGEREF _Toc226996794 \h </w:instrText>
             </w:r>
             <w:r>
               <w:rPr>
@@ -1453,7 +1453,7 @@
               <w14:ligatures w14:val="standardContextual"/>
             </w:rPr>
           </w:pPr>
-          <w:hyperlink w:anchor="_Toc211989221" w:history="1">
+          <w:hyperlink w:anchor="_Toc226996795" w:history="1">
             <w:r>
               <w:rPr>
                 <w:rStyle w:val="Hyperlink"/>
@@ -1480,7 +1480,7 @@
                 <w:noProof/>
                 <w:webHidden/>
               </w:rPr>
-              <w:instrText xml:space="preserve"> PAGEREF _Toc211989221 \h </w:instrText>
+              <w:instrText xml:space="preserve"> PAGEREF _Toc226996795 \h </w:instrText>
             </w:r>
             <w:r>
               <w:rPr>
@@ -1525,7 +1525,7 @@
               <w14:ligatures w14:val="standardContextual"/>
             </w:rPr>
           </w:pPr>
-          <w:hyperlink w:anchor="_Toc211989222" w:history="1">
+          <w:hyperlink w:anchor="_Toc226996796" w:history="1">
             <w:r>
               <w:rPr>
                 <w:rStyle w:val="Hyperlink"/>
@@ -1552,7 +1552,7 @@
                 <w:noProof/>
                 <w:webHidden/>
               </w:rPr>
-              <w:instrText xml:space="preserve"> PAGEREF _Toc211989222 \h </w:instrText>
+              <w:instrText xml:space="preserve"> PAGEREF _Toc226996796 \h </w:instrText>
             </w:r>
             <w:r>
               <w:rPr>
@@ -1597,7 +1597,7 @@
               <w14:ligatures w14:val="standardContextual"/>
             </w:rPr>
           </w:pPr>
-          <w:hyperlink w:anchor="_Toc211989223" w:history="1">
+          <w:hyperlink w:anchor="_Toc226996797" w:history="1">
             <w:r>
               <w:rPr>
                 <w:rStyle w:val="Hyperlink"/>
@@ -1624,7 +1624,7 @@
                 <w:noProof/>
                 <w:webHidden/>
               </w:rPr>
-              <w:instrText xml:space="preserve"> PAGEREF _Toc211989223 \h </w:instrText>
+              <w:instrText xml:space="preserve"> PAGEREF _Toc226996797 \h </w:instrText>
             </w:r>
             <w:r>
               <w:rPr>
@@ -1669,7 +1669,7 @@
               <w14:ligatures w14:val="standardContextual"/>
             </w:rPr>
           </w:pPr>
-          <w:hyperlink w:anchor="_Toc211989224" w:history="1">
+          <w:hyperlink w:anchor="_Toc226996798" w:history="1">
             <w:r>
               <w:rPr>
                 <w:rStyle w:val="Hyperlink"/>
@@ -1696,7 +1696,7 @@
                 <w:noProof/>
                 <w:webHidden/>
               </w:rPr>
-              <w:instrText xml:space="preserve"> PAGEREF _Toc211989224 \h </w:instrText>
+              <w:instrText xml:space="preserve"> PAGEREF _Toc226996798 \h </w:instrText>
             </w:r>
             <w:r>
               <w:rPr>
@@ -1741,7 +1741,7 @@
               <w14:ligatures w14:val="standardContextual"/>
             </w:rPr>
           </w:pPr>
-          <w:hyperlink w:anchor="_Toc211989225" w:history="1">
+          <w:hyperlink w:anchor="_Toc226996799" w:history="1">
             <w:r>
               <w:rPr>
                 <w:rStyle w:val="Hyperlink"/>
@@ -1768,7 +1768,7 @@
                 <w:noProof/>
                 <w:webHidden/>
               </w:rPr>
-              <w:instrText xml:space="preserve"> PAGEREF _Toc211989225 \h </w:instrText>
+              <w:instrText xml:space="preserve"> PAGEREF _Toc226996799 \h </w:instrText>
             </w:r>
             <w:r>
               <w:rPr>
@@ -1813,7 +1813,7 @@
               <w14:ligatures w14:val="standardContextual"/>
             </w:rPr>
           </w:pPr>
-          <w:hyperlink w:anchor="_Toc211989226" w:history="1">
+          <w:hyperlink w:anchor="_Toc226996800" w:history="1">
             <w:r>
               <w:rPr>
                 <w:rStyle w:val="Hyperlink"/>
@@ -1840,7 +1840,7 @@
                 <w:noProof/>
                 <w:webHidden/>
               </w:rPr>
-              <w:instrText xml:space="preserve"> PAGEREF _Toc211989226 \h </w:instrText>
+              <w:instrText xml:space="preserve"> PAGEREF _Toc226996800 \h </w:instrText>
             </w:r>
             <w:r>
               <w:rPr>
@@ -1885,12 +1885,11 @@
               <w14:ligatures w14:val="standardContextual"/>
             </w:rPr>
           </w:pPr>
-          <w:hyperlink w:anchor="_Toc211989227" w:history="1">
+          <w:hyperlink w:anchor="_Toc226996801" w:history="1">
             <w:r>
               <w:rPr>
                 <w:rStyle w:val="Hyperlink"/>
                 <w:noProof/>
-                <w:lang w:val="de-DE"/>
               </w:rPr>
               <w:t>Fuel System</w:t>
             </w:r>
@@ -1913,7 +1912,7 @@
                 <w:noProof/>
                 <w:webHidden/>
               </w:rPr>
-              <w:instrText xml:space="preserve"> PAGEREF _Toc211989227 \h </w:instrText>
+              <w:instrText xml:space="preserve"> PAGEREF _Toc226996801 \h </w:instrText>
             </w:r>
             <w:r>
               <w:rPr>
@@ -1958,12 +1957,11 @@
               <w14:ligatures w14:val="standardContextual"/>
             </w:rPr>
           </w:pPr>
-          <w:hyperlink w:anchor="_Toc211989228" w:history="1">
+          <w:hyperlink w:anchor="_Toc226996802" w:history="1">
             <w:r>
               <w:rPr>
                 <w:rStyle w:val="Hyperlink"/>
                 <w:noProof/>
-                <w:lang w:val="de-DE"/>
               </w:rPr>
               <w:t>Alternate Fuel Burn</w:t>
             </w:r>
@@ -1986,7 +1984,7 @@
                 <w:noProof/>
                 <w:webHidden/>
               </w:rPr>
-              <w:instrText xml:space="preserve"> PAGEREF _Toc211989228 \h </w:instrText>
+              <w:instrText xml:space="preserve"> PAGEREF _Toc226996802 \h </w:instrText>
             </w:r>
             <w:r>
               <w:rPr>
@@ -2031,7 +2029,7 @@
               <w14:ligatures w14:val="standardContextual"/>
             </w:rPr>
           </w:pPr>
-          <w:hyperlink w:anchor="_Toc211989229" w:history="1">
+          <w:hyperlink w:anchor="_Toc226996803" w:history="1">
             <w:r>
               <w:rPr>
                 <w:rStyle w:val="Hyperlink"/>
@@ -2058,7 +2056,7 @@
                 <w:noProof/>
                 <w:webHidden/>
               </w:rPr>
-              <w:instrText xml:space="preserve"> PAGEREF _Toc211989229 \h </w:instrText>
+              <w:instrText xml:space="preserve"> PAGEREF _Toc226996803 \h </w:instrText>
             </w:r>
             <w:r>
               <w:rPr>
@@ -2103,7 +2101,7 @@
               <w14:ligatures w14:val="standardContextual"/>
             </w:rPr>
           </w:pPr>
-          <w:hyperlink w:anchor="_Toc211989230" w:history="1">
+          <w:hyperlink w:anchor="_Toc226996804" w:history="1">
             <w:r>
               <w:rPr>
                 <w:rStyle w:val="Hyperlink"/>
@@ -2130,7 +2128,7 @@
                 <w:noProof/>
                 <w:webHidden/>
               </w:rPr>
-              <w:instrText xml:space="preserve"> PAGEREF _Toc211989230 \h </w:instrText>
+              <w:instrText xml:space="preserve"> PAGEREF _Toc226996804 \h </w:instrText>
             </w:r>
             <w:r>
               <w:rPr>
@@ -2175,12 +2173,11 @@
               <w14:ligatures w14:val="standardContextual"/>
             </w:rPr>
           </w:pPr>
-          <w:hyperlink w:anchor="_Toc211989231" w:history="1">
+          <w:hyperlink w:anchor="_Toc226996805" w:history="1">
             <w:r>
               <w:rPr>
                 <w:rStyle w:val="Hyperlink"/>
                 <w:noProof/>
-                <w:lang w:val="de-DE"/>
               </w:rPr>
               <w:t>Instrumentation</w:t>
             </w:r>
@@ -2203,7 +2200,7 @@
                 <w:noProof/>
                 <w:webHidden/>
               </w:rPr>
-              <w:instrText xml:space="preserve"> PAGEREF _Toc211989231 \h </w:instrText>
+              <w:instrText xml:space="preserve"> PAGEREF _Toc226996805 \h </w:instrText>
             </w:r>
             <w:r>
               <w:rPr>
@@ -2248,7 +2245,7 @@
               <w14:ligatures w14:val="standardContextual"/>
             </w:rPr>
           </w:pPr>
-          <w:hyperlink w:anchor="_Toc211989232" w:history="1">
+          <w:hyperlink w:anchor="_Toc226996806" w:history="1">
             <w:r>
               <w:rPr>
                 <w:rStyle w:val="Hyperlink"/>
@@ -2275,7 +2272,7 @@
                 <w:noProof/>
                 <w:webHidden/>
               </w:rPr>
-              <w:instrText xml:space="preserve"> PAGEREF _Toc211989232 \h </w:instrText>
+              <w:instrText xml:space="preserve"> PAGEREF _Toc226996806 \h </w:instrText>
             </w:r>
             <w:r>
               <w:rPr>
@@ -2320,7 +2317,7 @@
               <w14:ligatures w14:val="standardContextual"/>
             </w:rPr>
           </w:pPr>
-          <w:hyperlink w:anchor="_Toc211989233" w:history="1">
+          <w:hyperlink w:anchor="_Toc226996807" w:history="1">
             <w:r>
               <w:rPr>
                 <w:rStyle w:val="Hyperlink"/>
@@ -2347,7 +2344,7 @@
                 <w:noProof/>
                 <w:webHidden/>
               </w:rPr>
-              <w:instrText xml:space="preserve"> PAGEREF _Toc211989233 \h </w:instrText>
+              <w:instrText xml:space="preserve"> PAGEREF _Toc226996807 \h </w:instrText>
             </w:r>
             <w:r>
               <w:rPr>
@@ -2406,7 +2403,7 @@
       <w:pPr>
         <w:pStyle w:val="Heading1"/>
       </w:pPr>
-      <w:bookmarkStart w:id="2" w:name="_Toc211989204"/>
+      <w:bookmarkStart w:id="2" w:name="_Toc226996778"/>
       <w:r>
         <w:lastRenderedPageBreak/>
         <w:t>Introduction</w:t>
@@ -2461,7 +2458,7 @@
       <w:pPr>
         <w:pStyle w:val="Heading1"/>
       </w:pPr>
-      <w:bookmarkStart w:id="3" w:name="_Toc211989205"/>
+      <w:bookmarkStart w:id="3" w:name="_Toc226996779"/>
       <w:r>
         <w:t>Autoflight and DFGS</w:t>
       </w:r>
@@ -2471,7 +2468,7 @@
       <w:pPr>
         <w:pStyle w:val="Heading2"/>
       </w:pPr>
-      <w:bookmarkStart w:id="4" w:name="_Toc211989206"/>
+      <w:bookmarkStart w:id="4" w:name="_Toc226996780"/>
       <w:r>
         <w:t>Automatic Thrust Restoration</w:t>
       </w:r>
@@ -2479,15 +2476,7 @@
     </w:p>
     <w:p>
       <w:r>
-        <w:t xml:space="preserve">On </w:t>
-      </w:r>
-      <w:proofErr w:type="gramStart"/>
-      <w:r>
-        <w:t>the MD</w:t>
-      </w:r>
-      <w:proofErr w:type="gramEnd"/>
-      <w:r>
-        <w:t>-80, the difference in engine indications for the Automatic Thrust Restoration (ATR) system to activate is 0.25 EPR or 7% N1.</w:t>
+        <w:t>On the MD-80, the difference in engine indications for the Automatic Thrust Restoration (ATR) system to activate is 0.25 EPR or 7% N1.</w:t>
       </w:r>
     </w:p>
     <w:p>
@@ -2505,7 +2494,7 @@
       <w:pPr>
         <w:pStyle w:val="Heading2"/>
       </w:pPr>
-      <w:bookmarkStart w:id="5" w:name="_Toc211989207"/>
+      <w:bookmarkStart w:id="5" w:name="_Toc226996781"/>
       <w:r>
         <w:t>Flight Mode Annunciator</w:t>
       </w:r>
@@ -2568,7 +2557,7 @@
       <w:pPr>
         <w:pStyle w:val="Heading2"/>
       </w:pPr>
-      <w:bookmarkStart w:id="6" w:name="_Toc211989208"/>
+      <w:bookmarkStart w:id="6" w:name="_Toc226996782"/>
       <w:r>
         <w:t>Mach Trim</w:t>
       </w:r>
@@ -2589,7 +2578,7 @@
       <w:pPr>
         <w:pStyle w:val="Heading2"/>
       </w:pPr>
-      <w:bookmarkStart w:id="7" w:name="_Toc211989209"/>
+      <w:bookmarkStart w:id="7" w:name="_Toc226996783"/>
       <w:r>
         <w:t>Performance and VNAV</w:t>
       </w:r>
@@ -2645,7 +2634,7 @@
       <w:pPr>
         <w:pStyle w:val="Heading1"/>
       </w:pPr>
-      <w:bookmarkStart w:id="8" w:name="_Toc211989210"/>
+      <w:bookmarkStart w:id="8" w:name="_Toc226996784"/>
       <w:r>
         <w:lastRenderedPageBreak/>
         <w:t xml:space="preserve">Auxiliary </w:t>
@@ -2695,7 +2684,13 @@
         <w:t xml:space="preserve"> On non-EFD airplanes, APU gauges are very similar those on ECU-equipped MD-80’s.</w:t>
       </w:r>
       <w:r>
-        <w:t xml:space="preserve"> On EFD airplanes, APU information is only displayed on the Systems Display, and not on the overhead.</w:t>
+        <w:t xml:space="preserve"> On EFD airplanes, APU information is only displayed on the System Display</w:t>
+      </w:r>
+      <w:r>
+        <w:t xml:space="preserve"> “ENG” page</w:t>
+      </w:r>
+      <w:r>
+        <w:t>, and not on the overhead.</w:t>
       </w:r>
     </w:p>
     <w:p/>
@@ -2703,7 +2698,7 @@
       <w:pPr>
         <w:pStyle w:val="Heading1"/>
       </w:pPr>
-      <w:bookmarkStart w:id="9" w:name="_Toc211989211"/>
+      <w:bookmarkStart w:id="9" w:name="_Toc226996785"/>
       <w:r>
         <w:t>Electrical System</w:t>
       </w:r>
@@ -2713,7 +2708,7 @@
       <w:pPr>
         <w:pStyle w:val="Heading2"/>
       </w:pPr>
-      <w:bookmarkStart w:id="10" w:name="_Toc211989212"/>
+      <w:bookmarkStart w:id="10" w:name="_Toc226996786"/>
       <w:r>
         <w:t>APU and External Power</w:t>
       </w:r>
@@ -2745,7 +2740,7 @@
       <w:pPr>
         <w:pStyle w:val="Heading2"/>
       </w:pPr>
-      <w:bookmarkStart w:id="11" w:name="_Toc211989213"/>
+      <w:bookmarkStart w:id="11" w:name="_Toc226996787"/>
       <w:r>
         <w:t>Batteries</w:t>
       </w:r>
@@ -2773,7 +2768,7 @@
       <w:pPr>
         <w:pStyle w:val="Heading2"/>
       </w:pPr>
-      <w:bookmarkStart w:id="12" w:name="_Toc211989214"/>
+      <w:bookmarkStart w:id="12" w:name="_Toc226996788"/>
       <w:r>
         <w:t>Emergency Power</w:t>
       </w:r>
@@ -2794,7 +2789,7 @@
       <w:pPr>
         <w:pStyle w:val="Heading2"/>
       </w:pPr>
-      <w:bookmarkStart w:id="13" w:name="_Toc211989215"/>
+      <w:bookmarkStart w:id="13" w:name="_Toc226996789"/>
       <w:r>
         <w:t>Electrical Power Control Unit</w:t>
       </w:r>
@@ -2807,30 +2802,14 @@
     </w:p>
     <w:p>
       <w:r>
-        <w:t xml:space="preserve">Some of the MD-90 electrical </w:t>
-      </w:r>
-      <w:proofErr w:type="gramStart"/>
-      <w:r>
-        <w:t>system is</w:t>
-      </w:r>
-      <w:proofErr w:type="gramEnd"/>
-      <w:r>
-        <w:t xml:space="preserve"> controlled by the Electrical Power Control Panel (EPCU). The EPCU will parallel sources to buses </w:t>
-      </w:r>
-      <w:proofErr w:type="gramStart"/>
-      <w:r>
-        <w:t>in order to</w:t>
-      </w:r>
-      <w:proofErr w:type="gramEnd"/>
-      <w:r>
-        <w:t xml:space="preserve"> prevent a break in power when transferring. The EPCU also controls the AC and DC bus ties as well as emergency power.</w:t>
+        <w:t>Some of the MD-90 electrical system is controlled by the Electrical Power Control Panel (EPCU). The EPCU will parallel sources to buses in order to prevent a break in power when transferring. The EPCU also controls the AC and DC bus ties as well as emergency power.</w:t>
       </w:r>
     </w:p>
     <w:p>
       <w:pPr>
         <w:pStyle w:val="Heading2"/>
       </w:pPr>
-      <w:bookmarkStart w:id="14" w:name="_Toc211989216"/>
+      <w:bookmarkStart w:id="14" w:name="_Toc226996790"/>
       <w:r>
         <w:lastRenderedPageBreak/>
         <w:t>Engine Generators</w:t>
@@ -2850,15 +2829,7 @@
     </w:p>
     <w:p>
       <w:r>
-        <w:t xml:space="preserve">There are </w:t>
-      </w:r>
-      <w:proofErr w:type="gramStart"/>
-      <w:r>
-        <w:t>not</w:t>
-      </w:r>
-      <w:proofErr w:type="gramEnd"/>
-      <w:r>
-        <w:t xml:space="preserve"> IDGs or CSDs on the MD-90. Engine electrical power is provided via </w:t>
+        <w:t xml:space="preserve">There are not IDGs or CSDs on the MD-90. Engine electrical power is provided via </w:t>
       </w:r>
       <w:r>
         <w:t>a Variable Speed Constant Frequency (VSCF) system. The generators output 232-400V 800-1600Hz</w:t>
@@ -2878,15 +2849,7 @@
     </w:p>
     <w:p>
       <w:r>
-        <w:t xml:space="preserve">Separate cooling is provided for the VSCFs in the E/E compartment in </w:t>
-      </w:r>
-      <w:proofErr w:type="gramStart"/>
-      <w:r>
-        <w:t>the front</w:t>
-      </w:r>
-      <w:proofErr w:type="gramEnd"/>
-      <w:r>
-        <w:t xml:space="preserve"> of the airplane.</w:t>
+        <w:t>Separate cooling is provided for the VSCFs in the E/E compartment in the front of the airplane.</w:t>
       </w:r>
     </w:p>
     <w:p/>
@@ -2894,7 +2857,7 @@
       <w:pPr>
         <w:pStyle w:val="Heading2"/>
       </w:pPr>
-      <w:bookmarkStart w:id="15" w:name="_Toc211989217"/>
+      <w:bookmarkStart w:id="15" w:name="_Toc226996791"/>
       <w:r>
         <w:t>Tie Buses</w:t>
       </w:r>
@@ -2902,15 +2865,7 @@
     </w:p>
     <w:p>
       <w:r>
-        <w:t>The MD-</w:t>
-      </w:r>
-      <w:proofErr w:type="gramStart"/>
-      <w:r>
-        <w:t>80 tie</w:t>
-      </w:r>
-      <w:proofErr w:type="gramEnd"/>
-      <w:r>
-        <w:t xml:space="preserve"> bus is controlled by a single switch. The normal position is “AUTO”.</w:t>
+        <w:t>The MD-80 tie bus is controlled by a single switch. The normal position is “AUTO”.</w:t>
       </w:r>
     </w:p>
     <w:p>
@@ -2932,7 +2887,7 @@
       <w:pPr>
         <w:pStyle w:val="Heading1"/>
       </w:pPr>
-      <w:bookmarkStart w:id="16" w:name="_Toc211989218"/>
+      <w:bookmarkStart w:id="16" w:name="_Toc226996792"/>
       <w:r>
         <w:t>Engines</w:t>
       </w:r>
@@ -2940,23 +2895,7 @@
     </w:p>
     <w:p>
       <w:r>
-        <w:t xml:space="preserve">The MD-80 has two Pratt &amp; Whitney JT8D-200 engines. The engines are controlled conventionally via cables from </w:t>
-      </w:r>
-      <w:proofErr w:type="gramStart"/>
-      <w:r>
-        <w:t>the throttles</w:t>
-      </w:r>
-      <w:proofErr w:type="gramEnd"/>
-      <w:r>
-        <w:t xml:space="preserve"> to </w:t>
-      </w:r>
-      <w:proofErr w:type="gramStart"/>
-      <w:r>
-        <w:t>the fuel</w:t>
-      </w:r>
-      <w:proofErr w:type="gramEnd"/>
-      <w:r>
-        <w:t xml:space="preserve"> control units.</w:t>
+        <w:t>The MD-80 has two Pratt &amp; Whitney JT8D-200 engines. The engines are controlled conventionally via cables from the throttles to the fuel control units.</w:t>
       </w:r>
       <w:r>
         <w:t xml:space="preserve"> Reverse thrust is accomplished via clamshell buckets.</w:t>
@@ -2981,7 +2920,7 @@
       <w:pPr>
         <w:pStyle w:val="Heading2"/>
       </w:pPr>
-      <w:bookmarkStart w:id="17" w:name="_Toc211989219"/>
+      <w:bookmarkStart w:id="17" w:name="_Toc226996793"/>
       <w:r>
         <w:t>Automatic Reserve Thrust</w:t>
       </w:r>
@@ -3008,7 +2947,7 @@
       <w:pPr>
         <w:pStyle w:val="Heading2"/>
       </w:pPr>
-      <w:bookmarkStart w:id="18" w:name="_Toc211989220"/>
+      <w:bookmarkStart w:id="18" w:name="_Toc226996794"/>
       <w:r>
         <w:t>Ignition</w:t>
       </w:r>
@@ -3035,7 +2974,7 @@
       <w:pPr>
         <w:pStyle w:val="Heading2"/>
       </w:pPr>
-      <w:bookmarkStart w:id="19" w:name="_Toc211989221"/>
+      <w:bookmarkStart w:id="19" w:name="_Toc226996795"/>
       <w:r>
         <w:lastRenderedPageBreak/>
         <w:t>Instrumentation</w:t>
@@ -3055,119 +2994,633 @@
     </w:p>
     <w:p>
       <w:r>
-        <w:t xml:space="preserve">The MD-90 has electronic instrumentation for the engines and has </w:t>
-      </w:r>
-      <w:proofErr w:type="gramStart"/>
-      <w:r>
-        <w:t>vibration indications added</w:t>
-      </w:r>
-      <w:proofErr w:type="gramEnd"/>
+        <w:t>The MD-90 has electronic instrumentation for the engines and has vibration indications added.</w:t>
+      </w:r>
+    </w:p>
+    <w:p/>
+    <w:p>
+      <w:pPr>
+        <w:pStyle w:val="Heading2"/>
+      </w:pPr>
+      <w:bookmarkStart w:id="20" w:name="_Toc226996796"/>
+      <w:r>
+        <w:t>N1 Mode</w:t>
+      </w:r>
+      <w:bookmarkEnd w:id="20"/>
+    </w:p>
+    <w:p>
+      <w:r>
+        <w:t>On the MD-80, Full Authority Digital Engine Control (FADEC) and thus N1 Mode is not installed.</w:t>
+      </w:r>
+    </w:p>
+    <w:p>
+      <w:r>
+        <w:t xml:space="preserve">On the MD-90, </w:t>
+      </w:r>
+      <w:r>
+        <w:t xml:space="preserve">the normal FADEC control mode is EPR. </w:t>
+      </w:r>
+      <w:r>
+        <w:t>N1 Mode can be activated if EPR indication is unreliable, or the system can automatically revert to N1 Mode</w:t>
+      </w:r>
+      <w:r>
+        <w:t xml:space="preserve"> if a failure occurs. N1 Mode is also used for reverse thrust. Thrust limitation and the Auto Thrust System (ATS) are not available in N1 Mode.</w:t>
+      </w:r>
+    </w:p>
+    <w:p/>
+    <w:p>
+      <w:pPr>
+        <w:pStyle w:val="Heading2"/>
+      </w:pPr>
+      <w:bookmarkStart w:id="21" w:name="_Toc226996797"/>
+      <w:r>
+        <w:t>Thrust Limits</w:t>
+      </w:r>
+      <w:bookmarkEnd w:id="21"/>
+    </w:p>
+    <w:p>
+      <w:r>
+        <w:t xml:space="preserve">On the MD-80, thrust limits are computed by the Digital Flight Guidance System. On aircraft without Engine Display Panel (EDP), the active limit is displayed and selected on the Thrust Rating Indicator (TRI). On aircraft with EDP, the active limit is displayed on the EDP and selected on the Thrust Rating Panel (TRP). </w:t>
+      </w:r>
+      <w:r>
+        <w:t>Separate</w:t>
+      </w:r>
+      <w:r>
+        <w:t xml:space="preserve"> “T/O” and “G/A” modes are available. </w:t>
+      </w:r>
+      <w:r>
+        <w:t xml:space="preserve">The </w:t>
+      </w:r>
+      <w:r>
+        <w:t xml:space="preserve">“CRZ” mode is available. </w:t>
+      </w:r>
+      <w:r>
+        <w:t xml:space="preserve">The </w:t>
+      </w:r>
+      <w:r>
+        <w:t>“EPR SEL”</w:t>
+      </w:r>
+      <w:r>
+        <w:t xml:space="preserve"> cutback</w:t>
+      </w:r>
+      <w:r>
+        <w:t xml:space="preserve"> mode is not </w:t>
+      </w:r>
+      <w:r>
+        <w:t>installed</w:t>
+      </w:r>
+      <w:r>
+        <w:t xml:space="preserve">. </w:t>
+      </w:r>
+      <w:r>
+        <w:t>Thrust limit selection is mostly manual aside from certain automatic transitions</w:t>
+      </w:r>
+      <w:r>
+        <w:t xml:space="preserve"> to </w:t>
+      </w:r>
+      <w:r>
+        <w:t>“</w:t>
+      </w:r>
+      <w:r>
+        <w:t>G/A</w:t>
+      </w:r>
+      <w:r>
+        <w:t>”</w:t>
+      </w:r>
+      <w:r>
+        <w:t xml:space="preserve"> mode</w:t>
+      </w:r>
       <w:r>
         <w:t>.</w:t>
       </w:r>
     </w:p>
+    <w:p>
+      <w:r>
+        <w:t>On the MD-90, thrust limits are computed by the Full Authority Digital Engine Control (FADEC) units installed on each engine.</w:t>
+      </w:r>
+      <w:r>
+        <w:t xml:space="preserve"> There are small differences between standard and EFD MD-90’s.</w:t>
+      </w:r>
+    </w:p>
+    <w:p>
+      <w:r>
+        <w:t xml:space="preserve">On </w:t>
+      </w:r>
+      <w:r>
+        <w:t xml:space="preserve">the </w:t>
+      </w:r>
+      <w:r>
+        <w:t xml:space="preserve">standard </w:t>
+      </w:r>
+      <w:r>
+        <w:t>MD-90</w:t>
+      </w:r>
+      <w:r>
+        <w:t>, the thrust limit operates similarly to MD-80</w:t>
+      </w:r>
+      <w:r>
+        <w:t xml:space="preserve">’s equipped </w:t>
+      </w:r>
+      <w:r>
+        <w:t>with EDP</w:t>
+      </w:r>
+      <w:r>
+        <w:t xml:space="preserve">. The </w:t>
+      </w:r>
+      <w:r>
+        <w:t>“</w:t>
+      </w:r>
+      <w:r>
+        <w:t>T/O</w:t>
+      </w:r>
+      <w:r>
+        <w:t>”</w:t>
+      </w:r>
+      <w:r>
+        <w:t xml:space="preserve"> and </w:t>
+      </w:r>
+      <w:r>
+        <w:t>“</w:t>
+      </w:r>
+      <w:r>
+        <w:t>G/A</w:t>
+      </w:r>
+      <w:r>
+        <w:t>”</w:t>
+      </w:r>
+      <w:r>
+        <w:t xml:space="preserve"> modes are combined into the “TOGA” mode. The </w:t>
+      </w:r>
+      <w:r>
+        <w:t>“</w:t>
+      </w:r>
+      <w:r>
+        <w:t>CRZ</w:t>
+      </w:r>
+      <w:r>
+        <w:t>”</w:t>
+      </w:r>
+      <w:r>
+        <w:t xml:space="preserve"> mode</w:t>
+      </w:r>
+      <w:r>
+        <w:t xml:space="preserve"> and automatic cutback are</w:t>
+      </w:r>
+      <w:r>
+        <w:t xml:space="preserve"> </w:t>
+      </w:r>
+      <w:r>
+        <w:t>only</w:t>
+      </w:r>
+      <w:r>
+        <w:t xml:space="preserve"> available</w:t>
+      </w:r>
+      <w:r>
+        <w:t xml:space="preserve"> on airplanes with the selectable 25K/28K thrust option</w:t>
+      </w:r>
+      <w:r>
+        <w:t>.</w:t>
+      </w:r>
+      <w:r>
+        <w:t xml:space="preserve"> Automatic cutback can be selected on the MCDU TAKEOFF page.</w:t>
+      </w:r>
+      <w:r>
+        <w:t xml:space="preserve"> </w:t>
+      </w:r>
+      <w:r>
+        <w:t xml:space="preserve">The </w:t>
+      </w:r>
+      <w:r>
+        <w:t>“EPR SEL”</w:t>
+      </w:r>
+      <w:r>
+        <w:t xml:space="preserve"> cutback</w:t>
+      </w:r>
+      <w:r>
+        <w:t xml:space="preserve"> mode is </w:t>
+      </w:r>
+      <w:r>
+        <w:t>in</w:t>
+      </w:r>
+      <w:r>
+        <w:t>stalled</w:t>
+      </w:r>
+      <w:r>
+        <w:t xml:space="preserve"> on airplanes that do NOT have the selectable 25K/28K thrust option</w:t>
+      </w:r>
+      <w:r>
+        <w:t>.</w:t>
+      </w:r>
+    </w:p>
+    <w:p>
+      <w:r>
+        <w:t xml:space="preserve">On the EFD MD-90, thrust limits are automatically selected by the Flight Management System (FMS), aside from the takeoff to climb thrust reduction. </w:t>
+      </w:r>
+      <w:r>
+        <w:t>“</w:t>
+      </w:r>
+      <w:r>
+        <w:t>T/O</w:t>
+      </w:r>
+      <w:r>
+        <w:t>”</w:t>
+      </w:r>
+      <w:r>
+        <w:t xml:space="preserve"> and </w:t>
+      </w:r>
+      <w:r>
+        <w:t>“</w:t>
+      </w:r>
+      <w:r>
+        <w:t>G/A</w:t>
+      </w:r>
+      <w:r>
+        <w:t>”</w:t>
+      </w:r>
+      <w:r>
+        <w:t xml:space="preserve"> are separate modes. The </w:t>
+      </w:r>
+      <w:r>
+        <w:t>“</w:t>
+      </w:r>
+      <w:r>
+        <w:t>CRZ</w:t>
+      </w:r>
+      <w:r>
+        <w:t>”</w:t>
+      </w:r>
+      <w:r>
+        <w:t xml:space="preserve"> mode is available. The thrust limit mode can be overridden in the Multi</w:t>
+      </w:r>
+      <w:r>
+        <w:t>f</w:t>
+      </w:r>
+      <w:r>
+        <w:t>unction Control and Display Unit (MCDU). Engine rating (25K or 28K)</w:t>
+      </w:r>
+      <w:r>
+        <w:t xml:space="preserve">, </w:t>
+      </w:r>
+      <w:r>
+        <w:t>FLEX takeoff</w:t>
+      </w:r>
+      <w:r>
+        <w:t>, and “EPR SEL”</w:t>
+      </w:r>
+      <w:r>
+        <w:t xml:space="preserve"> display </w:t>
+      </w:r>
+      <w:r>
+        <w:t>via the MCDU</w:t>
+      </w:r>
+      <w:r>
+        <w:t xml:space="preserve"> THRUST LIMITS page</w:t>
+      </w:r>
+      <w:r>
+        <w:t>. FLEX takeoff is only available with the 25K rating</w:t>
+      </w:r>
+      <w:r>
+        <w:t xml:space="preserve"> selected</w:t>
+      </w:r>
+      <w:r>
+        <w:t>.</w:t>
+      </w:r>
+      <w:r>
+        <w:t xml:space="preserve"> Automatic cutback can be selected on the </w:t>
+      </w:r>
+      <w:r>
+        <w:t xml:space="preserve">MCDU </w:t>
+      </w:r>
+      <w:r>
+        <w:t>TAKEOFF 2/2 page.</w:t>
+      </w:r>
+    </w:p>
+    <w:p>
+      <w:r>
+        <w:t xml:space="preserve">When </w:t>
+      </w:r>
+      <w:r>
+        <w:t xml:space="preserve">the </w:t>
+      </w:r>
+      <w:r>
+        <w:t>“</w:t>
+      </w:r>
+      <w:r>
+        <w:t>T/O</w:t>
+      </w:r>
+      <w:r>
+        <w:t>”</w:t>
+      </w:r>
+      <w:r>
+        <w:t xml:space="preserve"> mode is active</w:t>
+      </w:r>
+      <w:r>
+        <w:t xml:space="preserve"> on the MD-90 EFD</w:t>
+      </w:r>
+      <w:r>
+        <w:t xml:space="preserve">, </w:t>
+      </w:r>
+      <w:r>
+        <w:t xml:space="preserve">the </w:t>
+      </w:r>
+      <w:r>
+        <w:t>“</w:t>
+      </w:r>
+      <w:r>
+        <w:t>CLB</w:t>
+      </w:r>
+      <w:r>
+        <w:t>”</w:t>
+      </w:r>
+      <w:r>
+        <w:t xml:space="preserve"> mode </w:t>
+      </w:r>
+      <w:r>
+        <w:t>can be</w:t>
+      </w:r>
+      <w:r>
+        <w:t xml:space="preserve"> armed by pulling the altitude knob when above 400 feet radio altitude.</w:t>
+      </w:r>
+      <w:r>
+        <w:t xml:space="preserve"> The </w:t>
+      </w:r>
+      <w:r>
+        <w:t>“</w:t>
+      </w:r>
+      <w:r>
+        <w:t>CLB</w:t>
+      </w:r>
+      <w:r>
+        <w:t>”</w:t>
+      </w:r>
+      <w:r>
+        <w:t xml:space="preserve"> mode will automatically engage at the thrust reduction altitude. Further mode changes are automatic.</w:t>
+      </w:r>
+    </w:p>
     <w:p/>
+    <w:p/>
+    <w:p/>
+    <w:p>
+      <w:pPr>
+        <w:pStyle w:val="Heading1"/>
+      </w:pPr>
+      <w:bookmarkStart w:id="22" w:name="_Toc226996798"/>
+      <w:r>
+        <w:lastRenderedPageBreak/>
+        <w:t>Flight Controls</w:t>
+      </w:r>
+      <w:bookmarkEnd w:id="22"/>
+    </w:p>
     <w:p>
       <w:pPr>
         <w:pStyle w:val="Heading2"/>
       </w:pPr>
-      <w:bookmarkStart w:id="20" w:name="_Toc211989222"/>
-      <w:r>
-        <w:t>N1 Mode</w:t>
-      </w:r>
-      <w:bookmarkEnd w:id="20"/>
-    </w:p>
-    <w:p>
-      <w:r>
-        <w:t xml:space="preserve">On the MD-80, Full Authority Digital Engine Control (FADEC) and thus N1 Mode </w:t>
-      </w:r>
-      <w:proofErr w:type="gramStart"/>
-      <w:r>
-        <w:t>is</w:t>
-      </w:r>
-      <w:proofErr w:type="gramEnd"/>
-      <w:r>
-        <w:t xml:space="preserve"> not installed.</w:t>
-      </w:r>
-    </w:p>
-    <w:p>
-      <w:r>
-        <w:t xml:space="preserve">On the MD-90, </w:t>
-      </w:r>
-      <w:r>
-        <w:t xml:space="preserve">the normal FADEC control mode is EPR. </w:t>
-      </w:r>
-      <w:r>
-        <w:t>N1 Mode can be activated if EPR indication is unreliable, or the system can automatically revert to N1 Mode</w:t>
-      </w:r>
-      <w:r>
-        <w:t xml:space="preserve"> if a failure occurs. N1 Mode is also used for reverse thrust. Thrust limitation and the Auto Thrust System (ATS) are not available in </w:t>
-      </w:r>
-      <w:proofErr w:type="gramStart"/>
-      <w:r>
-        <w:t>N1 Mode</w:t>
-      </w:r>
-      <w:proofErr w:type="gramEnd"/>
+      <w:bookmarkStart w:id="23" w:name="_Toc226996799"/>
+      <w:r>
+        <w:t>Elevators</w:t>
+      </w:r>
+      <w:bookmarkEnd w:id="23"/>
+    </w:p>
+    <w:p>
+      <w:r>
+        <w:t>The MD-80’s elevators are normally manually flown by control tabs. If the elevators are commanded more than 10 degrees nose down, the elevator is hydraulically driven</w:t>
+      </w:r>
+      <w:r>
+        <w:t xml:space="preserve"> downward</w:t>
+      </w:r>
       <w:r>
         <w:t>.</w:t>
       </w:r>
     </w:p>
+    <w:p>
+      <w:r>
+        <w:t xml:space="preserve">The MD-90’s elevators are normally hydraulically driven. Manual reversion to control tabs is available if hydraulics fail or the ELEV CONT ELEV switch is selected </w:t>
+      </w:r>
+      <w:r>
+        <w:t>“OFF”</w:t>
+      </w:r>
+      <w:r>
+        <w:t>.</w:t>
+      </w:r>
+    </w:p>
     <w:p/>
     <w:p>
       <w:pPr>
         <w:pStyle w:val="Heading2"/>
       </w:pPr>
-      <w:bookmarkStart w:id="21" w:name="_Toc211989223"/>
-      <w:r>
-        <w:t>Thrust Limits</w:t>
-      </w:r>
-      <w:bookmarkEnd w:id="21"/>
-    </w:p>
-    <w:p>
-      <w:r>
-        <w:t xml:space="preserve">On the MD-80, thrust limits are computed by the Digital Flight Guidance System. On aircraft without Engine Display Panel (EDP), the active limit is displayed and selected on the Thrust Rating Indicator (TRI). On aircraft with EDP, the active limit is displayed on the EDP and selected on the Thrust Rating Panel (TRP). </w:t>
-      </w:r>
-      <w:r>
-        <w:t>Separate</w:t>
-      </w:r>
-      <w:r>
-        <w:t xml:space="preserve"> “T/O” and “G/A” modes are available. </w:t>
-      </w:r>
-      <w:r>
-        <w:t xml:space="preserve">The </w:t>
-      </w:r>
-      <w:r>
-        <w:t xml:space="preserve">“CRZ” mode is available. </w:t>
-      </w:r>
-      <w:r>
-        <w:t xml:space="preserve">The </w:t>
-      </w:r>
-      <w:r>
-        <w:t xml:space="preserve">“EPR SEL” mode is not </w:t>
-      </w:r>
-      <w:r>
-        <w:t>available</w:t>
-      </w:r>
-      <w:r>
-        <w:t xml:space="preserve">. </w:t>
-      </w:r>
-      <w:r>
-        <w:t>Thrust limit selection is mostly manual aside from certain automatic transitions</w:t>
-      </w:r>
-      <w:r>
-        <w:t xml:space="preserve"> to </w:t>
+      <w:bookmarkStart w:id="24" w:name="_Toc226996800"/>
+      <w:r>
+        <w:t>Pylon Flaps</w:t>
+      </w:r>
+      <w:bookmarkEnd w:id="24"/>
+    </w:p>
+    <w:p>
+      <w:r>
+        <w:t>The MD-80 does not have pylon flaps.</w:t>
+      </w:r>
+    </w:p>
+    <w:p>
+      <w:r>
+        <w:t>The MD-90 has flaps on the engine pylons which deflect downward hydraulically when the yoke reaches the full nose down position. This aids downward pitching motion during stalling conditions which may are stronger than on the MD-80 due to the heavier engines.</w:t>
+      </w:r>
+    </w:p>
+    <w:p/>
+    <w:p>
+      <w:pPr>
+        <w:pStyle w:val="Heading1"/>
+      </w:pPr>
+      <w:bookmarkStart w:id="25" w:name="_Toc226996801"/>
+      <w:r>
+        <w:t>Fuel System</w:t>
+      </w:r>
+      <w:bookmarkEnd w:id="25"/>
+    </w:p>
+    <w:p>
+      <w:pPr>
+        <w:pStyle w:val="Heading2"/>
+      </w:pPr>
+      <w:bookmarkStart w:id="26" w:name="_Toc226996802"/>
+      <w:r>
+        <w:t>Alternate Fuel Burn</w:t>
+      </w:r>
+      <w:bookmarkEnd w:id="26"/>
+    </w:p>
+    <w:p>
+      <w:r>
+        <w:t xml:space="preserve">Alternate Fuel Burn (AFB) burns the fuel tanks in </w:t>
+      </w:r>
+      <w:r>
+        <w:t xml:space="preserve">an </w:t>
+      </w:r>
+      <w:r>
+        <w:t>alternating order when the center tank switches are in the “AUTO” position. The MD-90 EFD has a separate AFB switch.</w:t>
+      </w:r>
+    </w:p>
+    <w:p>
+      <w:r>
+        <w:t xml:space="preserve">Not all MD-80’s have </w:t>
+      </w:r>
+      <w:r>
+        <w:t xml:space="preserve">AFB </w:t>
+      </w:r>
+      <w:r>
+        <w:t>installed.</w:t>
+      </w:r>
+    </w:p>
+    <w:p>
+      <w:r>
+        <w:t xml:space="preserve">MD-80 </w:t>
+      </w:r>
+      <w:r>
+        <w:t>fuel schedule is as follows when AFB is enabled:</w:t>
+      </w:r>
+      <w:r>
+        <w:br/>
+        <w:t>- Center tank to 10,000 pounds</w:t>
+      </w:r>
+      <w:r>
+        <w:br/>
+        <w:t>- Main tanks to 4,000 pounds</w:t>
+      </w:r>
+      <w:r>
+        <w:br/>
+        <w:t>- Center tank to empty</w:t>
+      </w:r>
+      <w:r>
+        <w:br/>
+        <w:t>- Main tanks to empty</w:t>
+      </w:r>
+    </w:p>
+    <w:p>
+      <w:r>
+        <w:t>All MD-90’s have AFB installed.</w:t>
+      </w:r>
+    </w:p>
+    <w:p>
+      <w:r>
+        <w:t>MD-90 fuel</w:t>
+      </w:r>
+      <w:r>
+        <w:t xml:space="preserve"> schedule is as follows when AFB is enabled:</w:t>
+      </w:r>
+      <w:r>
+        <w:br/>
+        <w:t xml:space="preserve">- </w:t>
+      </w:r>
+      <w:r>
+        <w:t>Center tank to 3,000</w:t>
+      </w:r>
+      <w:r>
+        <w:t xml:space="preserve"> pounds</w:t>
+      </w:r>
+      <w:r>
+        <w:br/>
+        <w:t>- M</w:t>
+      </w:r>
+      <w:r>
+        <w:t>ain tanks to</w:t>
+      </w:r>
+      <w:r>
+        <w:t xml:space="preserve"> </w:t>
+      </w:r>
+      <w:r>
+        <w:t>4,000</w:t>
+      </w:r>
+      <w:r>
+        <w:t xml:space="preserve"> pounds</w:t>
+      </w:r>
+      <w:r>
+        <w:br/>
+        <w:t>- C</w:t>
+      </w:r>
+      <w:r>
+        <w:t>enter tank to</w:t>
+      </w:r>
+      <w:r>
+        <w:t xml:space="preserve"> </w:t>
+      </w:r>
+      <w:r>
+        <w:t>empty</w:t>
+      </w:r>
+      <w:r>
+        <w:br/>
+        <w:t>- Main tanks to empty</w:t>
+      </w:r>
+    </w:p>
+    <w:p/>
+    <w:p/>
+    <w:p/>
+    <w:p>
+      <w:pPr>
+        <w:pStyle w:val="Heading2"/>
+      </w:pPr>
+      <w:bookmarkStart w:id="27" w:name="_Toc226996803"/>
+      <w:r>
+        <w:lastRenderedPageBreak/>
+        <w:t>Fuel Heat</w:t>
+      </w:r>
+      <w:r>
+        <w:t xml:space="preserve"> and Recirculation</w:t>
+      </w:r>
+      <w:bookmarkEnd w:id="27"/>
+    </w:p>
+    <w:p>
+      <w:r>
+        <w:t>The MD-80 has manual fuel heat installed.</w:t>
+      </w:r>
+      <w:r>
+        <w:t xml:space="preserve"> A recirculation system is not installed.</w:t>
+      </w:r>
+    </w:p>
+    <w:p>
+      <w:r>
+        <w:t xml:space="preserve">The MD-90 does not have fuel heat. </w:t>
+      </w:r>
+      <w:r>
+        <w:t>Return To Tank (RTT)</w:t>
+      </w:r>
+      <w:r>
+        <w:t xml:space="preserve"> recirculation is performed automatically instead.</w:t>
+      </w:r>
+    </w:p>
+    <w:p/>
+    <w:p>
+      <w:pPr>
+        <w:pStyle w:val="Heading1"/>
+      </w:pPr>
+      <w:bookmarkStart w:id="28" w:name="_Toc226996804"/>
+      <w:r>
+        <w:t>Hydraulic System</w:t>
+      </w:r>
+      <w:bookmarkEnd w:id="28"/>
+    </w:p>
+    <w:p>
+      <w:r>
+        <w:t xml:space="preserve">On the MD-80, the left and right engine pumps have </w:t>
+      </w:r>
+      <w:r>
+        <w:t>“OFF”, “</w:t>
+      </w:r>
+      <w:r>
+        <w:t>LO</w:t>
+      </w:r>
+      <w:r>
+        <w:t>”,</w:t>
+      </w:r>
+      <w:r>
+        <w:t xml:space="preserve"> and </w:t>
       </w:r>
       <w:r>
         <w:t>“</w:t>
       </w:r>
       <w:r>
-        <w:t>G/A</w:t>
+        <w:t>HI</w:t>
       </w:r>
       <w:r>
         <w:t>”</w:t>
       </w:r>
       <w:r>
-        <w:t xml:space="preserve"> mode</w:t>
+        <w:t xml:space="preserve"> positions</w:t>
       </w:r>
       <w:r>
         <w:t>.</w:t>
@@ -3175,228 +3628,185 @@
     </w:p>
     <w:p>
       <w:r>
-        <w:t xml:space="preserve">On </w:t>
-      </w:r>
-      <w:proofErr w:type="gramStart"/>
-      <w:r>
-        <w:t>the MD</w:t>
-      </w:r>
-      <w:proofErr w:type="gramEnd"/>
-      <w:r>
-        <w:t>-90, thrust limits are computed by the Full Authority Digital Engine Control (FADEC) units installed on each engine.</w:t>
-      </w:r>
-      <w:r>
-        <w:t xml:space="preserve"> There are small differences between standard and EFD MD-90’s.</w:t>
-      </w:r>
-    </w:p>
-    <w:p>
-      <w:r>
-        <w:t xml:space="preserve">On </w:t>
-      </w:r>
-      <w:r>
-        <w:t xml:space="preserve">the </w:t>
-      </w:r>
-      <w:r>
-        <w:t xml:space="preserve">standard </w:t>
-      </w:r>
-      <w:r>
-        <w:t>MD-90</w:t>
-      </w:r>
-      <w:r>
-        <w:t>, the thrust limit operates similarly to MD-80</w:t>
-      </w:r>
-      <w:r>
-        <w:t xml:space="preserve">’s equipped </w:t>
-      </w:r>
-      <w:r>
-        <w:t>with EDP</w:t>
-      </w:r>
-      <w:r>
-        <w:t xml:space="preserve">. The </w:t>
-      </w:r>
-      <w:r>
-        <w:t>“</w:t>
-      </w:r>
-      <w:r>
-        <w:t>T/O</w:t>
-      </w:r>
-      <w:r>
-        <w:t>”</w:t>
-      </w:r>
-      <w:r>
-        <w:t xml:space="preserve"> and </w:t>
-      </w:r>
-      <w:r>
-        <w:t>“</w:t>
-      </w:r>
-      <w:r>
-        <w:t>G/A</w:t>
-      </w:r>
-      <w:r>
-        <w:t>”</w:t>
-      </w:r>
-      <w:r>
-        <w:t xml:space="preserve"> modes are combined into the “TOGA” mode. The </w:t>
-      </w:r>
-      <w:r>
-        <w:t>“</w:t>
-      </w:r>
-      <w:r>
-        <w:t>CRZ</w:t>
-      </w:r>
-      <w:r>
-        <w:t>”</w:t>
-      </w:r>
-      <w:r>
-        <w:t xml:space="preserve"> mode </w:t>
-      </w:r>
-      <w:r>
-        <w:t>is not available</w:t>
-      </w:r>
-      <w:r>
-        <w:t xml:space="preserve">. </w:t>
-      </w:r>
-      <w:r>
-        <w:t xml:space="preserve">The </w:t>
-      </w:r>
-      <w:r>
-        <w:t>“EPR SEL”</w:t>
-      </w:r>
-      <w:r>
-        <w:t xml:space="preserve"> mode is </w:t>
-      </w:r>
-      <w:r>
-        <w:t>installed</w:t>
+        <w:t>On the MD-90, the pumps only have “OFF” and “ON” positions</w:t>
       </w:r>
       <w:r>
         <w:t>.</w:t>
       </w:r>
     </w:p>
-    <w:p>
-      <w:r>
-        <w:t xml:space="preserve">On the EFD MD-90, thrust limits are automatically selected by the Flight Management System (FMS), aside from the takeoff to climb thrust reduction. </w:t>
-      </w:r>
-      <w:r>
-        <w:t>“</w:t>
-      </w:r>
-      <w:r>
-        <w:t>T/O</w:t>
-      </w:r>
-      <w:r>
-        <w:t>”</w:t>
-      </w:r>
-      <w:r>
-        <w:t xml:space="preserve"> and </w:t>
-      </w:r>
-      <w:r>
-        <w:t>“</w:t>
-      </w:r>
-      <w:r>
-        <w:t>G/A</w:t>
-      </w:r>
-      <w:r>
-        <w:t>”</w:t>
-      </w:r>
-      <w:r>
-        <w:t xml:space="preserve"> are separate modes. The </w:t>
-      </w:r>
-      <w:r>
-        <w:t>“</w:t>
-      </w:r>
-      <w:r>
-        <w:t>CRZ</w:t>
-      </w:r>
-      <w:r>
-        <w:t>”</w:t>
-      </w:r>
-      <w:r>
-        <w:t xml:space="preserve"> mode is available. The thrust limit mode can be overridden in the Multi</w:t>
-      </w:r>
-      <w:r>
-        <w:t>f</w:t>
-      </w:r>
-      <w:r>
-        <w:t>unction Control and Display Unit (MCDU). Engine rating (25K or 28K)</w:t>
-      </w:r>
-      <w:r>
-        <w:t xml:space="preserve">, </w:t>
-      </w:r>
-      <w:r>
-        <w:t>FLEX takeoff</w:t>
-      </w:r>
-      <w:r>
-        <w:t>, and “EPR SEL” mode are</w:t>
-      </w:r>
-      <w:r>
-        <w:t xml:space="preserve"> selected via the MCDU. FLEX takeoff is only available with the 25K rating</w:t>
-      </w:r>
-      <w:r>
-        <w:t xml:space="preserve"> selected</w:t>
-      </w:r>
-      <w:r>
-        <w:t>.</w:t>
-      </w:r>
-    </w:p>
-    <w:p>
-      <w:r>
-        <w:t xml:space="preserve">When </w:t>
-      </w:r>
-      <w:r>
-        <w:t xml:space="preserve">the </w:t>
-      </w:r>
-      <w:r>
-        <w:t>“</w:t>
-      </w:r>
-      <w:r>
-        <w:t>T/O</w:t>
-      </w:r>
-      <w:r>
-        <w:t>”</w:t>
-      </w:r>
-      <w:r>
-        <w:t xml:space="preserve"> mode is active</w:t>
-      </w:r>
-      <w:r>
-        <w:t xml:space="preserve"> on the MD-90 EFD</w:t>
-      </w:r>
-      <w:r>
-        <w:t xml:space="preserve">, </w:t>
-      </w:r>
-      <w:r>
-        <w:t xml:space="preserve">the </w:t>
-      </w:r>
-      <w:r>
-        <w:t>“</w:t>
-      </w:r>
-      <w:r>
-        <w:t>CLB</w:t>
-      </w:r>
-      <w:r>
-        <w:t>”</w:t>
-      </w:r>
-      <w:r>
-        <w:t xml:space="preserve"> mode </w:t>
-      </w:r>
-      <w:r>
-        <w:t>can be</w:t>
-      </w:r>
-      <w:r>
-        <w:t xml:space="preserve"> armed by pulling the altitude knob when above 400 feet radio altitude.</w:t>
-      </w:r>
-      <w:r>
-        <w:t xml:space="preserve"> The </w:t>
-      </w:r>
-      <w:r>
-        <w:t>“</w:t>
-      </w:r>
-      <w:r>
-        <w:t>CLB</w:t>
-      </w:r>
-      <w:r>
-        <w:t>”</w:t>
-      </w:r>
-      <w:r>
-        <w:t xml:space="preserve"> mode will automatically engage at the thrust reduction altitude. Further mode changes are automatic.</w:t>
+    <w:p/>
+    <w:p>
+      <w:pPr>
+        <w:pStyle w:val="Heading1"/>
+      </w:pPr>
+      <w:bookmarkStart w:id="29" w:name="_Toc226996805"/>
+      <w:r>
+        <w:t>Instrumentation</w:t>
+      </w:r>
+      <w:bookmarkEnd w:id="29"/>
+    </w:p>
+    <w:p>
+      <w:r>
+        <w:t>This section will not describe what is installed in the MD-80. It will only describe what is changed on the MD-90.</w:t>
+      </w:r>
+    </w:p>
+    <w:p/>
+    <w:p>
+      <w:pPr>
+        <w:pStyle w:val="Heading2"/>
+      </w:pPr>
+      <w:bookmarkStart w:id="30" w:name="_Toc226996806"/>
+      <w:r>
+        <w:t xml:space="preserve">Standard </w:t>
+      </w:r>
+      <w:r>
+        <w:t>Flight Deck</w:t>
+      </w:r>
+      <w:bookmarkEnd w:id="30"/>
+    </w:p>
+    <w:p>
+      <w:r>
+        <w:rPr>
+          <w:u w:val="single"/>
+        </w:rPr>
+        <w:t>Engine Display Panel</w:t>
+      </w:r>
+      <w:r>
+        <w:rPr>
+          <w:u w:val="single"/>
+        </w:rPr>
+        <w:t xml:space="preserve"> (EDP)</w:t>
+      </w:r>
+      <w:r>
+        <w:t>:</w:t>
+      </w:r>
+      <w:r>
+        <w:rPr>
+          <w:u w:val="single"/>
+        </w:rPr>
+        <w:br/>
+      </w:r>
+      <w:r>
+        <w:t>- Thrust rating (25K or 28K) is displayed</w:t>
+      </w:r>
+      <w:r>
+        <w:t xml:space="preserve"> only on airplanes with </w:t>
+      </w:r>
+      <w:r>
+        <w:t xml:space="preserve">the selectable </w:t>
+      </w:r>
+      <w:r>
+        <w:t>25K/28K thrust</w:t>
+      </w:r>
+      <w:r>
+        <w:t xml:space="preserve"> option</w:t>
+      </w:r>
+      <w:r>
+        <w:br/>
+        <w:t>- EPR limit is displayed separately for each engine</w:t>
+      </w:r>
+      <w:r>
+        <w:rPr>
+          <w:u w:val="single"/>
+        </w:rPr>
+        <w:br/>
+      </w:r>
+      <w:r>
+        <w:t xml:space="preserve">- </w:t>
+      </w:r>
+      <w:r>
+        <w:t xml:space="preserve">EPR command </w:t>
+      </w:r>
+      <w:r>
+        <w:t>shown on</w:t>
+      </w:r>
+      <w:r>
+        <w:t xml:space="preserve"> the EPR indicator</w:t>
+      </w:r>
+      <w:r>
+        <w:br/>
+      </w:r>
+      <w:r>
+        <w:t>- N2 is displayed as a digital value only</w:t>
+      </w:r>
+    </w:p>
+    <w:p>
+      <w:r>
+        <w:rPr>
+          <w:u w:val="single"/>
+        </w:rPr>
+        <w:t>Flight Management System</w:t>
+      </w:r>
+      <w:r>
+        <w:rPr>
+          <w:u w:val="single"/>
+        </w:rPr>
+        <w:t xml:space="preserve"> (FMS)</w:t>
+      </w:r>
+      <w:r>
+        <w:t>:</w:t>
+      </w:r>
+      <w:r>
+        <w:br/>
+        <w:t>- Honeywell AFMS is the only FMS option</w:t>
+      </w:r>
+      <w:r>
+        <w:br/>
+        <w:t>- VNAV is installed on all airplanes</w:t>
+      </w:r>
+    </w:p>
+    <w:p>
+      <w:r>
+        <w:rPr>
+          <w:u w:val="single"/>
+        </w:rPr>
+        <w:t>Systems Display Panel</w:t>
+      </w:r>
+      <w:r>
+        <w:rPr>
+          <w:u w:val="single"/>
+        </w:rPr>
+        <w:t xml:space="preserve"> (SDP)</w:t>
+      </w:r>
+      <w:r>
+        <w:t>:</w:t>
+      </w:r>
+      <w:r>
+        <w:br/>
+        <w:t>- TAT is displayed instead of RAT</w:t>
+      </w:r>
+      <w:r>
+        <w:br/>
+        <w:t>- Engine vibration is displayed</w:t>
+      </w:r>
+    </w:p>
+    <w:p>
+      <w:r>
+        <w:rPr>
+          <w:u w:val="single"/>
+        </w:rPr>
+        <w:t>Thrust Rating Panel</w:t>
+      </w:r>
+      <w:r>
+        <w:rPr>
+          <w:u w:val="single"/>
+        </w:rPr>
+        <w:t xml:space="preserve"> (TRP)</w:t>
+      </w:r>
+      <w:r>
+        <w:t>:</w:t>
+      </w:r>
+      <w:r>
+        <w:br/>
+        <w:t>- T/O and G/A buttons are replaced with TOGA.</w:t>
+      </w:r>
+      <w:r>
+        <w:br/>
+        <w:t>- CRZ button is removed</w:t>
+      </w:r>
+      <w:r>
+        <w:br/>
+        <w:t>- EPR SEL button is added</w:t>
       </w:r>
     </w:p>
     <w:p/>
@@ -3405,338 +3815,29 @@
     <w:p/>
     <w:p>
       <w:pPr>
-        <w:pStyle w:val="Heading1"/>
-      </w:pPr>
-      <w:bookmarkStart w:id="22" w:name="_Toc211989224"/>
+        <w:pStyle w:val="Heading2"/>
+      </w:pPr>
+      <w:bookmarkStart w:id="31" w:name="_Toc226996807"/>
       <w:r>
         <w:lastRenderedPageBreak/>
-        <w:t>Flight Controls</w:t>
-      </w:r>
-      <w:bookmarkEnd w:id="22"/>
-    </w:p>
-    <w:p>
-      <w:pPr>
-        <w:pStyle w:val="Heading2"/>
-      </w:pPr>
-      <w:bookmarkStart w:id="23" w:name="_Toc211989225"/>
-      <w:r>
-        <w:t>Elevators</w:t>
-      </w:r>
-      <w:bookmarkEnd w:id="23"/>
-    </w:p>
-    <w:p>
-      <w:r>
-        <w:t>The MD-80’s elevators are normally manually flown by control tabs. If the elevators are commanded more than 10 degrees nose down, the elevator is hydraulically driven</w:t>
-      </w:r>
-      <w:r>
-        <w:t xml:space="preserve"> downward</w:t>
-      </w:r>
-      <w:r>
-        <w:t>.</w:t>
-      </w:r>
-    </w:p>
-    <w:p>
-      <w:r>
-        <w:t xml:space="preserve">The </w:t>
-      </w:r>
-      <w:proofErr w:type="gramStart"/>
-      <w:r>
-        <w:t>MD-90’s</w:t>
-      </w:r>
-      <w:proofErr w:type="gramEnd"/>
-      <w:r>
-        <w:t xml:space="preserve"> elevators are normally hydraulically driven. Manual reversion to control tabs is available if hydraulics fail or the ELEV CONT ELEV switch is selected </w:t>
-      </w:r>
-      <w:r>
-        <w:t>“OFF”</w:t>
-      </w:r>
-      <w:r>
-        <w:t>.</w:t>
-      </w:r>
-    </w:p>
-    <w:p/>
-    <w:p>
-      <w:pPr>
-        <w:pStyle w:val="Heading2"/>
-      </w:pPr>
-      <w:bookmarkStart w:id="24" w:name="_Toc211989226"/>
-      <w:r>
-        <w:t>Pylon Flaps</w:t>
-      </w:r>
-      <w:bookmarkEnd w:id="24"/>
-    </w:p>
-    <w:p>
-      <w:r>
-        <w:t>The MD-80 does not have pylon flaps.</w:t>
-      </w:r>
-    </w:p>
-    <w:p>
-      <w:r>
-        <w:t>The MD-90 has flaps on the engine pylons which deflect downward hydraulically when the yoke reaches the full nose down position. This aids downward pitching motion during stalling conditions which may are stronger than on the MD-80 due to the heavier engines.</w:t>
-      </w:r>
-    </w:p>
-    <w:p/>
-    <w:p>
-      <w:pPr>
-        <w:pStyle w:val="Heading1"/>
-      </w:pPr>
-      <w:bookmarkStart w:id="25" w:name="_Toc211989227"/>
-      <w:r>
-        <w:t>Fuel System</w:t>
-      </w:r>
-      <w:bookmarkEnd w:id="25"/>
-    </w:p>
-    <w:p>
-      <w:pPr>
-        <w:pStyle w:val="Heading2"/>
-      </w:pPr>
-      <w:bookmarkStart w:id="26" w:name="_Toc211989228"/>
-      <w:r>
-        <w:t>Alternate Fuel Burn</w:t>
-      </w:r>
-      <w:bookmarkEnd w:id="26"/>
-    </w:p>
-    <w:p>
-      <w:r>
-        <w:t xml:space="preserve">Alternate Fuel Burn (AFB) burns the fuel tanks in </w:t>
-      </w:r>
-      <w:r>
-        <w:t xml:space="preserve">an </w:t>
-      </w:r>
-      <w:r>
-        <w:t>alternating order when the center tank switches are in the “AUTO” position. The MD-90 EFD has a separate AFB switch.</w:t>
-      </w:r>
-    </w:p>
-    <w:p>
-      <w:r>
-        <w:t xml:space="preserve">Not all MD-80’s </w:t>
-      </w:r>
-      <w:proofErr w:type="gramStart"/>
-      <w:r>
-        <w:t>have</w:t>
-      </w:r>
-      <w:proofErr w:type="gramEnd"/>
-      <w:r>
-        <w:t xml:space="preserve"> </w:t>
-      </w:r>
-      <w:r>
-        <w:t xml:space="preserve">AFB </w:t>
-      </w:r>
-      <w:r>
-        <w:t>installed.</w:t>
-      </w:r>
-    </w:p>
-    <w:p>
-      <w:r>
-        <w:t xml:space="preserve">MD-80 </w:t>
-      </w:r>
-      <w:r>
-        <w:t>fuel schedule is as follows when AFB is enabled:</w:t>
-      </w:r>
-      <w:r>
-        <w:br/>
-        <w:t>- Center tank to 10,000 pounds</w:t>
-      </w:r>
-      <w:r>
-        <w:br/>
-        <w:t>- Main tanks to 4,000 pounds</w:t>
-      </w:r>
-      <w:r>
-        <w:br/>
-        <w:t>- Center tank to empty</w:t>
-      </w:r>
-      <w:r>
-        <w:br/>
-        <w:t>- Main tanks to empty</w:t>
-      </w:r>
-    </w:p>
-    <w:p>
-      <w:r>
-        <w:t xml:space="preserve">All MD-90’s </w:t>
-      </w:r>
-      <w:proofErr w:type="gramStart"/>
-      <w:r>
-        <w:t>have</w:t>
-      </w:r>
-      <w:proofErr w:type="gramEnd"/>
-      <w:r>
-        <w:t xml:space="preserve"> AFB installed.</w:t>
-      </w:r>
-    </w:p>
-    <w:p>
-      <w:r>
-        <w:t>MD-90 fuel</w:t>
-      </w:r>
-      <w:r>
-        <w:t xml:space="preserve"> schedule is as follows when AFB is enabled:</w:t>
-      </w:r>
-      <w:r>
-        <w:br/>
-        <w:t xml:space="preserve">- </w:t>
-      </w:r>
-      <w:r>
-        <w:t>Center tank to 3,000</w:t>
-      </w:r>
-      <w:r>
-        <w:t xml:space="preserve"> pounds</w:t>
-      </w:r>
-      <w:r>
-        <w:br/>
-        <w:t>- M</w:t>
-      </w:r>
-      <w:r>
-        <w:t>ain tanks to</w:t>
-      </w:r>
-      <w:r>
-        <w:t xml:space="preserve"> </w:t>
-      </w:r>
-      <w:r>
-        <w:t>4,000</w:t>
-      </w:r>
-      <w:r>
-        <w:t xml:space="preserve"> pounds</w:t>
-      </w:r>
-      <w:r>
-        <w:br/>
-        <w:t>- C</w:t>
-      </w:r>
-      <w:r>
-        <w:t>enter tank to</w:t>
-      </w:r>
-      <w:r>
-        <w:t xml:space="preserve"> </w:t>
-      </w:r>
-      <w:r>
-        <w:t>empty</w:t>
-      </w:r>
-      <w:r>
-        <w:br/>
-        <w:t>- Main tanks to empty</w:t>
-      </w:r>
-    </w:p>
-    <w:p/>
-    <w:p/>
-    <w:p/>
-    <w:p>
-      <w:pPr>
-        <w:pStyle w:val="Heading2"/>
-      </w:pPr>
-      <w:bookmarkStart w:id="27" w:name="_Toc211989229"/>
-      <w:r>
-        <w:lastRenderedPageBreak/>
-        <w:t>Fuel Heat</w:t>
-      </w:r>
-      <w:r>
-        <w:t xml:space="preserve"> and Recirculation</w:t>
-      </w:r>
-      <w:bookmarkEnd w:id="27"/>
-    </w:p>
-    <w:p>
-      <w:r>
-        <w:t>The MD-80 has manual fuel heat installed.</w:t>
-      </w:r>
-      <w:r>
-        <w:t xml:space="preserve"> A recirculation system is not installed.</w:t>
-      </w:r>
-    </w:p>
-    <w:p>
-      <w:r>
-        <w:t xml:space="preserve">The MD-90 does not have fuel heat. </w:t>
-      </w:r>
-      <w:r>
-        <w:t>Return To Tank (RTT)</w:t>
-      </w:r>
-      <w:r>
-        <w:t xml:space="preserve"> recirculation is performed automatically instead.</w:t>
-      </w:r>
-    </w:p>
-    <w:p/>
-    <w:p>
-      <w:pPr>
-        <w:pStyle w:val="Heading1"/>
-      </w:pPr>
-      <w:bookmarkStart w:id="28" w:name="_Toc211989230"/>
-      <w:r>
-        <w:t>Hydraulic System</w:t>
-      </w:r>
-      <w:bookmarkEnd w:id="28"/>
-    </w:p>
-    <w:p>
-      <w:r>
-        <w:t xml:space="preserve">On the MD-80, the left and right engine pumps have </w:t>
-      </w:r>
-      <w:r>
-        <w:t>“OFF”, “</w:t>
-      </w:r>
-      <w:r>
-        <w:t>LO</w:t>
-      </w:r>
-      <w:r>
-        <w:t>”,</w:t>
-      </w:r>
-      <w:r>
-        <w:t xml:space="preserve"> and </w:t>
-      </w:r>
-      <w:r>
-        <w:t>“</w:t>
-      </w:r>
-      <w:r>
-        <w:t>HI</w:t>
-      </w:r>
-      <w:r>
-        <w:t>”</w:t>
-      </w:r>
-      <w:r>
-        <w:t xml:space="preserve"> positions</w:t>
-      </w:r>
-      <w:r>
-        <w:t>.</w:t>
-      </w:r>
-    </w:p>
-    <w:p>
-      <w:r>
-        <w:t>On the MD-90, the pumps only have “OFF” and “ON” positions</w:t>
-      </w:r>
-      <w:r>
-        <w:t>.</w:t>
-      </w:r>
-    </w:p>
-    <w:p/>
-    <w:p>
-      <w:pPr>
-        <w:pStyle w:val="Heading1"/>
-      </w:pPr>
-      <w:bookmarkStart w:id="29" w:name="_Toc211989231"/>
-      <w:r>
-        <w:t>Instrumentation</w:t>
-      </w:r>
-      <w:bookmarkEnd w:id="29"/>
-    </w:p>
-    <w:p>
-      <w:r>
-        <w:t>This section will not describe what is installed in the MD-80. It will only describe what is changed on the MD-90.</w:t>
-      </w:r>
-    </w:p>
-    <w:p/>
-    <w:p>
-      <w:pPr>
-        <w:pStyle w:val="Heading2"/>
-      </w:pPr>
-      <w:bookmarkStart w:id="30" w:name="_Toc211989232"/>
-      <w:r>
-        <w:t xml:space="preserve">Standard </w:t>
-      </w:r>
-      <w:r>
-        <w:t>Flight Deck</w:t>
-      </w:r>
-      <w:bookmarkEnd w:id="30"/>
+        <w:t>Enhanced Flight Deck</w:t>
+      </w:r>
+      <w:bookmarkEnd w:id="31"/>
+    </w:p>
+    <w:p>
+      <w:r>
+        <w:t>The Enhanced Flight Deck (EFD) contains several major and minor changes to the flightdeck to make it similar to the upcoming Advanced Common Flightdeck in design for the MD-95 (Boeing 717).</w:t>
+      </w:r>
     </w:p>
     <w:p>
       <w:r>
         <w:rPr>
           <w:u w:val="single"/>
         </w:rPr>
-        <w:t>EDP:</w:t>
+        <w:t>Major Changes</w:t>
+      </w:r>
+      <w:r>
+        <w:t>:</w:t>
       </w:r>
       <w:r>
         <w:rPr>
@@ -3745,11 +3846,52 @@
         <w:br/>
       </w:r>
       <w:r>
-        <w:t>- Thrust rating (25K or 28K) is displayed</w:t>
+        <w:t>- Six 8-inch Honeywell VIA Display Units (DU) replace conventional dials</w:t>
       </w:r>
       <w:r>
         <w:br/>
-        <w:t>- EPR limit is displayed separately for each engine</w:t>
+        <w:t>- EFIS Control Panels (ECPs) are installed for the new Navigation Displays</w:t>
+      </w:r>
+      <w:r>
+        <w:br/>
+        <w:t>- Display Control Panels (DCPs) is installed to control altimeter and minimums settings</w:t>
+      </w:r>
+      <w:r>
+        <w:br/>
+        <w:t>- A new push-button overhead panel using the dark cockpit concept is installed</w:t>
+      </w:r>
+      <w:r>
+        <w:br/>
+        <w:t>- A new pedestal containing new radios, audio panels, and DU controls is installed</w:t>
+      </w:r>
+      <w:r>
+        <w:br/>
+        <w:t>- The transponder is relocated to the overhead</w:t>
+      </w:r>
+      <w:r>
+        <w:br/>
+        <w:t>- TRP functionality is relocated to the Multifunction Control and Display Unit (MCDU)</w:t>
+      </w:r>
+      <w:r>
+        <w:br/>
+        <w:t>- Exterior light switches are relocated to the overhead</w:t>
+      </w:r>
+    </w:p>
+    <w:p>
+      <w:r>
+        <w:rPr>
+          <w:u w:val="single"/>
+        </w:rPr>
+        <w:t>Primary Flight Display</w:t>
+      </w:r>
+      <w:r>
+        <w:rPr>
+          <w:u w:val="single"/>
+        </w:rPr>
+        <w:t xml:space="preserve"> (PFD)</w:t>
+      </w:r>
+      <w:r>
+        <w:t>:</w:t>
       </w:r>
       <w:r>
         <w:rPr>
@@ -3758,22 +3900,19 @@
         <w:br/>
       </w:r>
       <w:r>
-        <w:t xml:space="preserve">- </w:t>
-      </w:r>
-      <w:r>
-        <w:t xml:space="preserve">EPR command </w:t>
-      </w:r>
-      <w:r>
-        <w:t>shown on</w:t>
-      </w:r>
-      <w:r>
-        <w:t xml:space="preserve"> the EPR indicator</w:t>
+        <w:t>- Airspeed is displayed as a tape on the left side</w:t>
       </w:r>
       <w:r>
         <w:br/>
-      </w:r>
-      <w:r>
-        <w:t>- N2 is displayed as a digital value only</w:t>
+        <w:t>- Altitude and vertical speed are displayed as tapes on the right side</w:t>
+      </w:r>
+      <w:r>
+        <w:br/>
+        <w:t>- The Flight Mode Annunciator (FMA) is displayed at the top</w:t>
+      </w:r>
+      <w:r>
+        <w:br/>
+        <w:t>- Heading is displayed on the bottom</w:t>
       </w:r>
     </w:p>
     <w:p>
@@ -3781,15 +3920,17 @@
         <w:rPr>
           <w:u w:val="single"/>
         </w:rPr>
-        <w:t>FMS:</w:t>
+        <w:t>Navigation Display (ND)</w:t>
+      </w:r>
+      <w:r>
+        <w:t>:</w:t>
       </w:r>
       <w:r>
         <w:br/>
-        <w:t>- Honeywell AFMS is the only FMS option</w:t>
-      </w:r>
-      <w:r>
-        <w:br/>
-        <w:t>- VNAV is installed on all airplanes</w:t>
+        <w:t>- Symbology differs</w:t>
+      </w:r>
+      <w:r>
+        <w:t>, is almost identical to the MD-11 and 717</w:t>
       </w:r>
     </w:p>
     <w:p>
@@ -3797,15 +3938,30 @@
         <w:rPr>
           <w:u w:val="single"/>
         </w:rPr>
-        <w:t>SDP:</w:t>
+        <w:t>Engine and Alert Display (EAD)</w:t>
+      </w:r>
+      <w:r>
+        <w:t>:</w:t>
       </w:r>
       <w:r>
         <w:br/>
-        <w:t>- TAT is displayed instead of RAT</w:t>
+        <w:t>- EPR, N1, EGT, and N2 are displayed as arcs with a needle pointer</w:t>
       </w:r>
       <w:r>
         <w:br/>
-        <w:t>- Engine vibration is displayed</w:t>
+        <w:t>- EPR has rolling digits, N1, EGT, and N2 display value digitally</w:t>
+      </w:r>
+      <w:r>
+        <w:br/>
+        <w:t>- EPR limits and thrust rating are displayed on the top</w:t>
+      </w:r>
+      <w:r>
+        <w:br/>
+        <w:t>- EPR limit is displayed as a “V” symbol instead of “||”</w:t>
+      </w:r>
+      <w:r>
+        <w:br/>
+        <w:t>- Cautions and Warnings are displayed on the lower section</w:t>
       </w:r>
     </w:p>
     <w:p>
@@ -3813,100 +3969,32 @@
         <w:rPr>
           <w:u w:val="single"/>
         </w:rPr>
-        <w:t>TRP:</w:t>
+        <w:t>System Display (SD)</w:t>
+      </w:r>
+      <w:r>
+        <w:t>:</w:t>
       </w:r>
       <w:r>
         <w:br/>
-        <w:t>- T/O and G/A buttons are replaced with TOGA.</w:t>
+        <w:t xml:space="preserve">- Displays data for </w:t>
+      </w:r>
+      <w:r>
+        <w:t>the respective</w:t>
+      </w:r>
+      <w:r>
+        <w:t xml:space="preserve"> systems on the AIR, ELEC, ENG, FUEL, and HYD pages</w:t>
       </w:r>
       <w:r>
         <w:br/>
-        <w:t>- CRZ button is removed</w:t>
+        <w:t>- Displays flight control and configuration information on the CONFIG page</w:t>
       </w:r>
       <w:r>
         <w:br/>
-        <w:t>- EPR SEL button is added</w:t>
-      </w:r>
-    </w:p>
-    <w:p/>
-    <w:p/>
-    <w:p/>
-    <w:p/>
-    <w:p>
-      <w:pPr>
-        <w:pStyle w:val="Heading2"/>
-      </w:pPr>
-      <w:bookmarkStart w:id="31" w:name="_Toc211989233"/>
-      <w:r>
-        <w:lastRenderedPageBreak/>
-        <w:t>Enhanced Flight Deck</w:t>
-      </w:r>
-      <w:bookmarkEnd w:id="31"/>
-    </w:p>
-    <w:p>
-      <w:r>
-        <w:t xml:space="preserve">The Enhanced Flight Deck (EFD) contains several major and minor changes to the </w:t>
-      </w:r>
-      <w:proofErr w:type="gramStart"/>
-      <w:r>
-        <w:t>flightdeck</w:t>
-      </w:r>
-      <w:proofErr w:type="gramEnd"/>
-      <w:r>
-        <w:t xml:space="preserve"> to make it </w:t>
-      </w:r>
-      <w:proofErr w:type="gramStart"/>
-      <w:r>
-        <w:t>similar to</w:t>
-      </w:r>
-      <w:proofErr w:type="gramEnd"/>
-      <w:r>
-        <w:t xml:space="preserve"> the upcoming Advanced Common Flightdeck in design for the MD-95 (Boeing 717).</w:t>
-      </w:r>
-    </w:p>
-    <w:p>
-      <w:r>
-        <w:rPr>
-          <w:u w:val="single"/>
-        </w:rPr>
-        <w:t>Major Changes:</w:t>
-      </w:r>
-      <w:r>
-        <w:rPr>
-          <w:u w:val="single"/>
-        </w:rPr>
+        <w:t>- Caution and Warnings displayed on each system’s page and on CONSEQ, MISC, and STATUS pages</w:t>
+      </w:r>
+      <w:r>
         <w:br/>
-      </w:r>
-      <w:r>
-        <w:t>- Six 8-inch Honeywell VIA Display Units (DU) replace conventional dials</w:t>
-      </w:r>
-      <w:r>
-        <w:br/>
-        <w:t>- EFIS Control Panels (ECPs) are installed for the new Navigation Displays</w:t>
-      </w:r>
-      <w:r>
-        <w:br/>
-        <w:t>- Display Control Panels (DCPs) is installed to control altimeter and minimums settings</w:t>
-      </w:r>
-      <w:r>
-        <w:br/>
-        <w:t>- A new push-button overhead panel using the dark cockpit concept is installed</w:t>
-      </w:r>
-      <w:r>
-        <w:br/>
-        <w:t>- A new pedestal containing new radios, audio panels, and DU controls is installed</w:t>
-      </w:r>
-      <w:r>
-        <w:br/>
-        <w:t>- The transponder is relocated to the overhead</w:t>
-      </w:r>
-      <w:r>
-        <w:br/>
-        <w:t>- TRP functionality is relocated to the Multifunction Control and Display Unit (MCDU)</w:t>
-      </w:r>
-      <w:r>
-        <w:br/>
-        <w:t>- Exterior light switches are relocated to the overhead</w:t>
+        <w:t>- Can display the ND if one of the other ND’s fail</w:t>
       </w:r>
     </w:p>
     <w:sectPr>
@@ -5803,6 +5891,118 @@
     </w:lvl>
   </w:abstractNum>
   <w:abstractNum w:abstractNumId="18" w15:restartNumberingAfterBreak="0">
+    <w:nsid w:val="6A6A3EF9"/>
+    <w:multiLevelType w:val="hybridMultilevel"/>
+    <w:tmpl w:val="91E47E8E"/>
+    <w:lvl w:ilvl="0" w:tplc="41C44F32">
+      <w:numFmt w:val="bullet"/>
+      <w:lvlText w:val="-"/>
+      <w:lvlJc w:val="left"/>
+      <w:pPr>
+        <w:ind w:left="720" w:hanging="360"/>
+      </w:pPr>
+      <w:rPr>
+        <w:rFonts w:ascii="Calibri" w:eastAsiaTheme="minorEastAsia" w:hAnsi="Calibri" w:cs="Calibri" w:hint="default"/>
+      </w:rPr>
+    </w:lvl>
+    <w:lvl w:ilvl="1" w:tplc="04090003" w:tentative="1">
+      <w:start w:val="1"/>
+      <w:numFmt w:val="bullet"/>
+      <w:lvlText w:val="o"/>
+      <w:lvlJc w:val="left"/>
+      <w:pPr>
+        <w:ind w:left="1440" w:hanging="360"/>
+      </w:pPr>
+      <w:rPr>
+        <w:rFonts w:ascii="Courier New" w:hAnsi="Courier New" w:cs="Courier New" w:hint="default"/>
+      </w:rPr>
+    </w:lvl>
+    <w:lvl w:ilvl="2" w:tplc="04090005" w:tentative="1">
+      <w:start w:val="1"/>
+      <w:numFmt w:val="bullet"/>
+      <w:lvlText w:val=""/>
+      <w:lvlJc w:val="left"/>
+      <w:pPr>
+        <w:ind w:left="2160" w:hanging="360"/>
+      </w:pPr>
+      <w:rPr>
+        <w:rFonts w:ascii="Wingdings" w:hAnsi="Wingdings" w:hint="default"/>
+      </w:rPr>
+    </w:lvl>
+    <w:lvl w:ilvl="3" w:tplc="04090001" w:tentative="1">
+      <w:start w:val="1"/>
+      <w:numFmt w:val="bullet"/>
+      <w:lvlText w:val=""/>
+      <w:lvlJc w:val="left"/>
+      <w:pPr>
+        <w:ind w:left="2880" w:hanging="360"/>
+      </w:pPr>
+      <w:rPr>
+        <w:rFonts w:ascii="Symbol" w:hAnsi="Symbol" w:hint="default"/>
+      </w:rPr>
+    </w:lvl>
+    <w:lvl w:ilvl="4" w:tplc="04090003" w:tentative="1">
+      <w:start w:val="1"/>
+      <w:numFmt w:val="bullet"/>
+      <w:lvlText w:val="o"/>
+      <w:lvlJc w:val="left"/>
+      <w:pPr>
+        <w:ind w:left="3600" w:hanging="360"/>
+      </w:pPr>
+      <w:rPr>
+        <w:rFonts w:ascii="Courier New" w:hAnsi="Courier New" w:cs="Courier New" w:hint="default"/>
+      </w:rPr>
+    </w:lvl>
+    <w:lvl w:ilvl="5" w:tplc="04090005" w:tentative="1">
+      <w:start w:val="1"/>
+      <w:numFmt w:val="bullet"/>
+      <w:lvlText w:val=""/>
+      <w:lvlJc w:val="left"/>
+      <w:pPr>
+        <w:ind w:left="4320" w:hanging="360"/>
+      </w:pPr>
+      <w:rPr>
+        <w:rFonts w:ascii="Wingdings" w:hAnsi="Wingdings" w:hint="default"/>
+      </w:rPr>
+    </w:lvl>
+    <w:lvl w:ilvl="6" w:tplc="04090001" w:tentative="1">
+      <w:start w:val="1"/>
+      <w:numFmt w:val="bullet"/>
+      <w:lvlText w:val=""/>
+      <w:lvlJc w:val="left"/>
+      <w:pPr>
+        <w:ind w:left="5040" w:hanging="360"/>
+      </w:pPr>
+      <w:rPr>
+        <w:rFonts w:ascii="Symbol" w:hAnsi="Symbol" w:hint="default"/>
+      </w:rPr>
+    </w:lvl>
+    <w:lvl w:ilvl="7" w:tplc="04090003" w:tentative="1">
+      <w:start w:val="1"/>
+      <w:numFmt w:val="bullet"/>
+      <w:lvlText w:val="o"/>
+      <w:lvlJc w:val="left"/>
+      <w:pPr>
+        <w:ind w:left="5760" w:hanging="360"/>
+      </w:pPr>
+      <w:rPr>
+        <w:rFonts w:ascii="Courier New" w:hAnsi="Courier New" w:cs="Courier New" w:hint="default"/>
+      </w:rPr>
+    </w:lvl>
+    <w:lvl w:ilvl="8" w:tplc="04090005" w:tentative="1">
+      <w:start w:val="1"/>
+      <w:numFmt w:val="bullet"/>
+      <w:lvlText w:val=""/>
+      <w:lvlJc w:val="left"/>
+      <w:pPr>
+        <w:ind w:left="6480" w:hanging="360"/>
+      </w:pPr>
+      <w:rPr>
+        <w:rFonts w:ascii="Wingdings" w:hAnsi="Wingdings" w:hint="default"/>
+      </w:rPr>
+    </w:lvl>
+  </w:abstractNum>
+  <w:abstractNum w:abstractNumId="19" w15:restartNumberingAfterBreak="0">
     <w:nsid w:val="6B225705"/>
     <w:multiLevelType w:val="hybridMultilevel"/>
     <w:tmpl w:val="B2CA95AE"/>
@@ -5891,7 +6091,7 @@
       </w:pPr>
     </w:lvl>
   </w:abstractNum>
-  <w:abstractNum w:abstractNumId="19" w15:restartNumberingAfterBreak="0">
+  <w:abstractNum w:abstractNumId="20" w15:restartNumberingAfterBreak="0">
     <w:nsid w:val="7315412F"/>
     <w:multiLevelType w:val="hybridMultilevel"/>
     <w:tmpl w:val="060C5FDC"/>
@@ -5980,7 +6180,7 @@
       </w:pPr>
     </w:lvl>
   </w:abstractNum>
-  <w:abstractNum w:abstractNumId="20" w15:restartNumberingAfterBreak="0">
+  <w:abstractNum w:abstractNumId="21" w15:restartNumberingAfterBreak="0">
     <w:nsid w:val="734164F5"/>
     <w:multiLevelType w:val="hybridMultilevel"/>
     <w:tmpl w:val="7398FF68"/>
@@ -6069,7 +6269,7 @@
       </w:pPr>
     </w:lvl>
   </w:abstractNum>
-  <w:abstractNum w:abstractNumId="21" w15:restartNumberingAfterBreak="0">
+  <w:abstractNum w:abstractNumId="22" w15:restartNumberingAfterBreak="0">
     <w:nsid w:val="7ECB17F3"/>
     <w:multiLevelType w:val="hybridMultilevel"/>
     <w:tmpl w:val="898E9DB6"/>
@@ -6162,7 +6362,7 @@
     <w:abstractNumId w:val="15"/>
   </w:num>
   <w:num w:numId="2" w16cid:durableId="1348365614">
-    <w:abstractNumId w:val="20"/>
+    <w:abstractNumId w:val="21"/>
   </w:num>
   <w:num w:numId="3" w16cid:durableId="1533877663">
     <w:abstractNumId w:val="2"/>
@@ -6186,7 +6386,7 @@
     <w:abstractNumId w:val="1"/>
   </w:num>
   <w:num w:numId="10" w16cid:durableId="1354455511">
-    <w:abstractNumId w:val="18"/>
+    <w:abstractNumId w:val="19"/>
   </w:num>
   <w:num w:numId="11" w16cid:durableId="2000108445">
     <w:abstractNumId w:val="0"/>
@@ -6198,7 +6398,7 @@
     <w:abstractNumId w:val="6"/>
   </w:num>
   <w:num w:numId="14" w16cid:durableId="620380582">
-    <w:abstractNumId w:val="21"/>
+    <w:abstractNumId w:val="22"/>
   </w:num>
   <w:num w:numId="15" w16cid:durableId="1834225066">
     <w:abstractNumId w:val="17"/>
@@ -6210,7 +6410,7 @@
     <w:abstractNumId w:val="4"/>
   </w:num>
   <w:num w:numId="18" w16cid:durableId="2068215267">
-    <w:abstractNumId w:val="19"/>
+    <w:abstractNumId w:val="20"/>
   </w:num>
   <w:num w:numId="19" w16cid:durableId="298458004">
     <w:abstractNumId w:val="9"/>
@@ -6223,6 +6423,9 @@
   </w:num>
   <w:num w:numId="22" w16cid:durableId="571233553">
     <w:abstractNumId w:val="12"/>
+  </w:num>
+  <w:num w:numId="23" w16cid:durableId="1438253256">
+    <w:abstractNumId w:val="18"/>
   </w:num>
 </w:numbering>
 </file>

</xml_diff>

<commit_message>
MD-90: More differences info
</commit_message>
<xml_diff>
--- a/MD-90/Differences.docx
+++ b/MD-90/Differences.docx
@@ -111,7 +111,7 @@
           <w:sz w:val="24"/>
           <w:szCs w:val="24"/>
         </w:rPr>
-        <w:t>4/13/2026</w:t>
+        <w:t>5/31/2026</w:t>
       </w:r>
       <w:r>
         <w:rPr>
@@ -2586,7 +2586,10 @@
     </w:p>
     <w:p>
       <w:r>
-        <w:t xml:space="preserve">MD-80’s equipped with a Performance Management System (PMS) have a </w:t>
+        <w:t>MD-80s</w:t>
+      </w:r>
+      <w:r>
+        <w:t xml:space="preserve"> equipped with a Performance Management System (PMS) have a </w:t>
       </w:r>
       <w:r>
         <w:t>“</w:t>
@@ -2627,7 +2630,13 @@
         <w:t>”</w:t>
       </w:r>
       <w:r>
-        <w:t xml:space="preserve"> buttons and VNAV modes are available on the Autoflight system. This is identical to MD-80’s equipped with Honeywell AFMS.</w:t>
+        <w:t xml:space="preserve"> buttons and VNAV modes are available on the Autoflight system. This is identical to </w:t>
+      </w:r>
+      <w:r>
+        <w:t>MD-80s</w:t>
+      </w:r>
+      <w:r>
+        <w:t xml:space="preserve"> equipped with Honeywell AFMS.</w:t>
       </w:r>
     </w:p>
     <w:p>
@@ -2681,7 +2690,19 @@
         <w:t xml:space="preserve"> ECU.</w:t>
       </w:r>
       <w:r>
-        <w:t xml:space="preserve"> On non-EFD airplanes, APU gauges are very similar those on ECU-equipped MD-80’s.</w:t>
+        <w:t xml:space="preserve"> On non-EFD airplanes, APU gauges are very </w:t>
+      </w:r>
+      <w:r>
+        <w:t>similar to</w:t>
+      </w:r>
+      <w:r>
+        <w:t xml:space="preserve"> those on ECU-equipped </w:t>
+      </w:r>
+      <w:r>
+        <w:t>MD-80s</w:t>
+      </w:r>
+      <w:r>
+        <w:t>.</w:t>
       </w:r>
       <w:r>
         <w:t xml:space="preserve"> On EFD airplanes, APU information is only displayed on the System Display</w:t>
@@ -2994,7 +3015,13 @@
     </w:p>
     <w:p>
       <w:r>
-        <w:t>The MD-90 has electronic instrumentation for the engines and has vibration indications added.</w:t>
+        <w:t xml:space="preserve">The MD-90 has electronic instrumentation for the engines and has </w:t>
+      </w:r>
+      <w:r>
+        <w:t>vibration indications</w:t>
+      </w:r>
+      <w:r>
+        <w:t>.</w:t>
       </w:r>
     </w:p>
     <w:p/>
@@ -3099,7 +3126,13 @@
         <w:t>On the MD-90, thrust limits are computed by the Full Authority Digital Engine Control (FADEC) units installed on each engine.</w:t>
       </w:r>
       <w:r>
-        <w:t xml:space="preserve"> There are small differences between standard and EFD MD-90’s.</w:t>
+        <w:t xml:space="preserve"> There are small differences between standard and EFD </w:t>
+      </w:r>
+      <w:r>
+        <w:t>MD-90s</w:t>
+      </w:r>
+      <w:r>
+        <w:t>.</w:t>
       </w:r>
     </w:p>
     <w:p>
@@ -3116,10 +3149,13 @@
         <w:t>MD-90</w:t>
       </w:r>
       <w:r>
-        <w:t>, the thrust limit operates similarly to MD-80</w:t>
-      </w:r>
-      <w:r>
-        <w:t xml:space="preserve">’s equipped </w:t>
+        <w:t xml:space="preserve">, the thrust limit operates similarly to </w:t>
+      </w:r>
+      <w:r>
+        <w:t>MD-80s</w:t>
+      </w:r>
+      <w:r>
+        <w:t xml:space="preserve"> equipped </w:t>
       </w:r>
       <w:r>
         <w:t>with EDP</w:t>
@@ -3383,7 +3419,13 @@
     </w:p>
     <w:p>
       <w:r>
-        <w:t>The MD-80’s elevators are normally manually flown by control tabs. If the elevators are commanded more than 10 degrees nose down, the elevator is hydraulically driven</w:t>
+        <w:t xml:space="preserve">The </w:t>
+      </w:r>
+      <w:r>
+        <w:t>MD-80s</w:t>
+      </w:r>
+      <w:r>
+        <w:t xml:space="preserve"> elevators are normally manually flown by control tabs. If the elevators are commanded more than 10 degrees nose down, the elevator is hydraulically driven</w:t>
       </w:r>
       <w:r>
         <w:t xml:space="preserve"> downward</w:t>
@@ -3394,7 +3436,13 @@
     </w:p>
     <w:p>
       <w:r>
-        <w:t xml:space="preserve">The MD-90’s elevators are normally hydraulically driven. Manual reversion to control tabs is available if hydraulics fail or the ELEV CONT ELEV switch is selected </w:t>
+        <w:t xml:space="preserve">The </w:t>
+      </w:r>
+      <w:r>
+        <w:t>MD-90s</w:t>
+      </w:r>
+      <w:r>
+        <w:t xml:space="preserve"> elevators are normally hydraulically driven. Manual reversion to control tabs is available if hydraulics fail or the ELEV CONT ELEV switch is selected </w:t>
       </w:r>
       <w:r>
         <w:t>“OFF”</w:t>
@@ -3458,7 +3506,13 @@
     </w:p>
     <w:p>
       <w:r>
-        <w:t xml:space="preserve">Not all MD-80’s have </w:t>
+        <w:t xml:space="preserve">Not all </w:t>
+      </w:r>
+      <w:r>
+        <w:t>MD-80s</w:t>
+      </w:r>
+      <w:r>
+        <w:t xml:space="preserve"> have </w:t>
       </w:r>
       <w:r>
         <w:t xml:space="preserve">AFB </w:t>
@@ -3493,7 +3547,13 @@
     </w:p>
     <w:p>
       <w:r>
-        <w:t>All MD-90’s have AFB installed.</w:t>
+        <w:t xml:space="preserve">All </w:t>
+      </w:r>
+      <w:r>
+        <w:t>MD-90s</w:t>
+      </w:r>
+      <w:r>
+        <w:t xml:space="preserve"> have AFB installed.</w:t>
       </w:r>
     </w:p>
     <w:p>
@@ -3866,15 +3926,26 @@
       </w:r>
       <w:r>
         <w:br/>
-        <w:t>- The transponder is relocated to the overhead</w:t>
+        <w:t xml:space="preserve">- </w:t>
+      </w:r>
+      <w:r>
+        <w:t xml:space="preserve">Exterior light switches </w:t>
+      </w:r>
+      <w:r>
+        <w:t>and t</w:t>
+      </w:r>
+      <w:r>
+        <w:t xml:space="preserve">he transponder </w:t>
+      </w:r>
+      <w:r>
+        <w:t>are</w:t>
+      </w:r>
+      <w:r>
+        <w:t xml:space="preserve"> relocated to the overhead</w:t>
       </w:r>
       <w:r>
         <w:br/>
         <w:t>- TRP functionality is relocated to the Multifunction Control and Display Unit (MCDU)</w:t>
-      </w:r>
-      <w:r>
-        <w:br/>
-        <w:t>- Exterior light switches are relocated to the overhead</w:t>
       </w:r>
     </w:p>
     <w:p>
@@ -3894,21 +3965,17 @@
         <w:t>:</w:t>
       </w:r>
       <w:r>
+        <w:br/>
+        <w:t>- The Flight Mode Annunciator (FMA) is displayed at the top</w:t>
+      </w:r>
+      <w:r>
         <w:rPr>
           <w:u w:val="single"/>
         </w:rPr>
         <w:br/>
       </w:r>
       <w:r>
-        <w:t>- Airspeed is displayed as a tape on the left side</w:t>
-      </w:r>
-      <w:r>
-        <w:br/>
-        <w:t>- Altitude and vertical speed are displayed as tapes on the right side</w:t>
-      </w:r>
-      <w:r>
-        <w:br/>
-        <w:t>- The Flight Mode Annunciator (FMA) is displayed at the top</w:t>
+        <w:t>- Airspeed, altitude, and vertical speed are displayed as a vertical tapes</w:t>
       </w:r>
       <w:r>
         <w:br/>
@@ -3930,7 +3997,13 @@
         <w:t>- Symbology differs</w:t>
       </w:r>
       <w:r>
-        <w:t>, is almost identical to the MD-11 and 717</w:t>
+        <w:t xml:space="preserve">, </w:t>
+      </w:r>
+      <w:r>
+        <w:t>but is</w:t>
+      </w:r>
+      <w:r>
+        <w:t xml:space="preserve"> almost identical to the MD-11 and 717</w:t>
       </w:r>
     </w:p>
     <w:p>
@@ -3995,6 +4068,133 @@
       <w:r>
         <w:br/>
         <w:t>- Can display the ND if one of the other ND’s fail</w:t>
+      </w:r>
+    </w:p>
+    <w:p/>
+    <w:p>
+      <w:pPr>
+        <w:pStyle w:val="Heading1"/>
+      </w:pPr>
+      <w:r>
+        <w:t>Pneumatic System</w:t>
+      </w:r>
+    </w:p>
+    <w:p>
+      <w:pPr>
+        <w:pStyle w:val="Heading2"/>
+      </w:pPr>
+      <w:r>
+        <w:t>Bleed and Pack Indications</w:t>
+      </w:r>
+    </w:p>
+    <w:p>
+      <w:r>
+        <w:t>On the MD-80, bleed pressure gauges are installed on the overhead. Pack flow gauges are not installed.</w:t>
+      </w:r>
+    </w:p>
+    <w:p>
+      <w:r>
+        <w:t>On the standard MD-90, bleed pressure gauges are not installed. Pack flow gauges are installed on the overhead.</w:t>
+      </w:r>
+    </w:p>
+    <w:p>
+      <w:r>
+        <w:t>On the MD-90 EFD, bleed pressure is displayed digitally on the synoptic. Pack flow is displayed on the synoptic as white (off), amber (low flow), or green (normal flow) impellers</w:t>
+      </w:r>
+      <w:r>
+        <w:t>.</w:t>
+      </w:r>
+    </w:p>
+    <w:p/>
+    <w:p>
+      <w:pPr>
+        <w:pStyle w:val="Heading2"/>
+      </w:pPr>
+      <w:r>
+        <w:lastRenderedPageBreak/>
+        <w:t>Cabin Air Recirulation Fan</w:t>
+      </w:r>
+    </w:p>
+    <w:p>
+      <w:r>
+        <w:t>On the MD-80, the cabin air recirculation fan only operates in flight.</w:t>
+      </w:r>
+    </w:p>
+    <w:p>
+      <w:r>
+        <w:t>On the MD-90, the cabin air recirculation fan operates as needed on the ground, and automatically in flight.</w:t>
+      </w:r>
+    </w:p>
+    <w:p/>
+    <w:p>
+      <w:pPr>
+        <w:pStyle w:val="Heading2"/>
+      </w:pPr>
+      <w:r>
+        <w:t>Pneumatic System Controller</w:t>
+      </w:r>
+    </w:p>
+    <w:p>
+      <w:r>
+        <w:t>The MD-80 does not have a Pneumatic System Controller installed.</w:t>
+      </w:r>
+    </w:p>
+    <w:p>
+      <w:r>
+        <w:t>The MD-90 Pneumatic System Controller automatically adjusts system components to control pressure and temperatures</w:t>
+      </w:r>
+      <w:r>
+        <w:t xml:space="preserve"> based on requirements for air conditioning and ice protection</w:t>
+      </w:r>
+      <w:r>
+        <w:t xml:space="preserve">. It also monitors the system and shuts down </w:t>
+      </w:r>
+      <w:r>
+        <w:t xml:space="preserve">failing </w:t>
+      </w:r>
+      <w:r>
+        <w:t>components if needed.</w:t>
+      </w:r>
+    </w:p>
+    <w:p/>
+    <w:p>
+      <w:pPr>
+        <w:pStyle w:val="Heading1"/>
+      </w:pPr>
+      <w:r>
+        <w:t>Warning Systems</w:t>
+      </w:r>
+    </w:p>
+    <w:p>
+      <w:pPr>
+        <w:pStyle w:val="Heading2"/>
+      </w:pPr>
+      <w:r>
+        <w:t>Warning Lamps</w:t>
+      </w:r>
+    </w:p>
+    <w:p>
+      <w:r>
+        <w:t xml:space="preserve">Some MD-80s have lamps for each </w:t>
+      </w:r>
+      <w:r>
+        <w:t xml:space="preserve">caution or </w:t>
+      </w:r>
+      <w:r>
+        <w:t>warning on forward section of the overhead panel.</w:t>
+      </w:r>
+    </w:p>
+    <w:p>
+      <w:r>
+        <w:t>Some MD-80s and all standard MD-90s have Electronic Overhead Alert Panel (EOAP) installed on the forward section of the overhead panel. MD-80s have a MONITOR light to advise of EOAP failures.</w:t>
+      </w:r>
+      <w:r>
+        <w:t xml:space="preserve"> MD-90s have a STATUS light instead that displays discrepancies or system information that requires no crew action.</w:t>
+      </w:r>
+    </w:p>
+    <w:p>
+      <w:r>
+        <w:t>The MD-90 EFD displays cautions and warnings on the bottom section of the Engine and Alert Display. They are also displayed on the respective System Display page.</w:t>
       </w:r>
     </w:p>
     <w:sectPr>

</xml_diff>